<commit_message>
Thu Feb 26 19:16:45 CST 2026
</commit_message>
<xml_diff>
--- a/send_Hr/简历A.docx
+++ b/send_Hr/简历A.docx
@@ -19,7 +19,128 @@
         <mc:AlternateContent>
           <mc:Choice Requires="wps">
             <w:drawing>
-              <wp:anchor distT="0" distB="0" distL="114300" distR="114300" simplePos="0" relativeHeight="251727872" behindDoc="0" locked="0" layoutInCell="1" allowOverlap="1" wp14:anchorId="63BBE8C5" wp14:editId="4F5E75B9">
+              <wp:anchor distT="0" distB="0" distL="114300" distR="114300" simplePos="0" relativeHeight="251725824" behindDoc="1" locked="0" layoutInCell="1" allowOverlap="1" wp14:anchorId="32FCE990" wp14:editId="54FC8D63">
+                <wp:simplePos x="0" y="0"/>
+                <wp:positionH relativeFrom="column">
+                  <wp:posOffset>-786985</wp:posOffset>
+                </wp:positionH>
+                <wp:positionV relativeFrom="paragraph">
+                  <wp:posOffset>-446405</wp:posOffset>
+                </wp:positionV>
+                <wp:extent cx="7709535" cy="2566035"/>
+                <wp:effectExtent l="0" t="0" r="24765" b="43815"/>
+                <wp:wrapNone/>
+                <wp:docPr id="62" name="流程图: 手动输入 2"/>
+                <wp:cNvGraphicFramePr/>
+                <a:graphic xmlns:a="http://schemas.openxmlformats.org/drawingml/2006/main">
+                  <a:graphicData uri="http://schemas.microsoft.com/office/word/2010/wordprocessingShape">
+                    <wps:wsp>
+                      <wps:cNvSpPr/>
+                      <wps:spPr>
+                        <a:xfrm rot="10800000" flipH="1">
+                          <a:off x="0" y="0"/>
+                          <a:ext cx="7709535" cy="2566035"/>
+                        </a:xfrm>
+                        <a:custGeom>
+                          <a:avLst/>
+                          <a:gdLst>
+                            <a:gd name="connsiteX0" fmla="*/ 0 w 10000"/>
+                            <a:gd name="connsiteY0" fmla="*/ 3036 h 10000"/>
+                            <a:gd name="connsiteX1" fmla="*/ 10000 w 10000"/>
+                            <a:gd name="connsiteY1" fmla="*/ 0 h 10000"/>
+                            <a:gd name="connsiteX2" fmla="*/ 10000 w 10000"/>
+                            <a:gd name="connsiteY2" fmla="*/ 10000 h 10000"/>
+                            <a:gd name="connsiteX3" fmla="*/ 0 w 10000"/>
+                            <a:gd name="connsiteY3" fmla="*/ 10000 h 10000"/>
+                            <a:gd name="connsiteX4" fmla="*/ 0 w 10000"/>
+                            <a:gd name="connsiteY4" fmla="*/ 3036 h 10000"/>
+                          </a:gdLst>
+                          <a:ahLst/>
+                          <a:cxnLst>
+                            <a:cxn ang="0">
+                              <a:pos x="connsiteX0" y="connsiteY0"/>
+                            </a:cxn>
+                            <a:cxn ang="0">
+                              <a:pos x="connsiteX1" y="connsiteY1"/>
+                            </a:cxn>
+                            <a:cxn ang="0">
+                              <a:pos x="connsiteX2" y="connsiteY2"/>
+                            </a:cxn>
+                            <a:cxn ang="0">
+                              <a:pos x="connsiteX3" y="connsiteY3"/>
+                            </a:cxn>
+                            <a:cxn ang="0">
+                              <a:pos x="connsiteX4" y="connsiteY4"/>
+                            </a:cxn>
+                          </a:cxnLst>
+                          <a:rect l="l" t="t" r="r" b="b"/>
+                          <a:pathLst>
+                            <a:path w="10000" h="10000">
+                              <a:moveTo>
+                                <a:pt x="0" y="3036"/>
+                              </a:moveTo>
+                              <a:lnTo>
+                                <a:pt x="10000" y="0"/>
+                              </a:lnTo>
+                              <a:lnTo>
+                                <a:pt x="10000" y="10000"/>
+                              </a:lnTo>
+                              <a:lnTo>
+                                <a:pt x="0" y="10000"/>
+                              </a:lnTo>
+                              <a:lnTo>
+                                <a:pt x="0" y="3036"/>
+                              </a:lnTo>
+                              <a:close/>
+                            </a:path>
+                          </a:pathLst>
+                        </a:custGeom>
+                        <a:solidFill>
+                          <a:srgbClr val="5290BF"/>
+                        </a:solidFill>
+                        <a:ln w="12700" cap="flat" cmpd="sng" algn="ctr">
+                          <a:solidFill>
+                            <a:srgbClr val="5290BF"/>
+                          </a:solidFill>
+                          <a:prstDash val="solid"/>
+                          <a:miter lim="800000"/>
+                        </a:ln>
+                        <a:effectLst/>
+                      </wps:spPr>
+                      <wps:bodyPr rot="0" spcFirstLastPara="0" vertOverflow="overflow" horzOverflow="overflow" vert="horz" wrap="square" lIns="91440" tIns="45720" rIns="91440" bIns="45720" numCol="1" spcCol="0" rtlCol="0" fromWordArt="0" anchor="ctr" anchorCtr="0" forceAA="0" compatLnSpc="1">
+                        <a:noAutofit/>
+                      </wps:bodyPr>
+                    </wps:wsp>
+                  </a:graphicData>
+                </a:graphic>
+                <wp14:sizeRelH relativeFrom="margin">
+                  <wp14:pctWidth>0</wp14:pctWidth>
+                </wp14:sizeRelH>
+                <wp14:sizeRelV relativeFrom="margin">
+                  <wp14:pctHeight>0</wp14:pctHeight>
+                </wp14:sizeRelV>
+              </wp:anchor>
+            </w:drawing>
+          </mc:Choice>
+          <mc:Fallback>
+            <w:pict>
+              <v:shape w14:anchorId="2BD92AA3" id="流程图: 手动输入 2" o:spid="_x0000_s1026" style="position:absolute;margin-left:-61.95pt;margin-top:-35.15pt;width:607.05pt;height:202.05pt;rotation:180;flip:x;z-index:-251590656;visibility:visible;mso-wrap-style:square;mso-width-percent:0;mso-height-percent:0;mso-wrap-distance-left:9pt;mso-wrap-distance-top:0;mso-wrap-distance-right:9pt;mso-wrap-distance-bottom:0;mso-position-horizontal:absolute;mso-position-horizontal-relative:text;mso-position-vertical:absolute;mso-position-vertical-relative:text;mso-width-percent:0;mso-height-percent:0;mso-width-relative:margin;mso-height-relative:margin;v-text-anchor:middle" coordsize="10000,10000" o:gfxdata="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" path="m,3036l10000,r,10000l,10000,,3036xe" fillcolor="#5290bf" strokecolor="#5290bf" strokeweight="1pt">
+                <v:stroke joinstyle="miter"/>
+                <v:path arrowok="t" o:connecttype="custom" o:connectlocs="0,779048;7709535,0;7709535,2566035;0,2566035;0,779048" o:connectangles="0,0,0,0,0"/>
+              </v:shape>
+            </w:pict>
+          </mc:Fallback>
+        </mc:AlternateContent>
+      </w:r>
+      <w:r>
+        <w:rPr>
+          <w:rFonts w:ascii="微软雅黑" w:eastAsia="微软雅黑" w:hAnsi="微软雅黑"/>
+          <w:noProof/>
+        </w:rPr>
+        <mc:AlternateContent>
+          <mc:Choice Requires="wps">
+            <w:drawing>
+              <wp:anchor distT="0" distB="0" distL="114300" distR="114300" simplePos="0" relativeHeight="251727872" behindDoc="0" locked="0" layoutInCell="1" allowOverlap="1" wp14:anchorId="63BBE8C5" wp14:editId="77BBFA74">
                 <wp:simplePos x="0" y="0"/>
                 <wp:positionH relativeFrom="column">
                   <wp:posOffset>-369567</wp:posOffset>
@@ -274,127 +395,6 @@
                     </w:p>
                   </w:txbxContent>
                 </v:textbox>
-              </v:shape>
-            </w:pict>
-          </mc:Fallback>
-        </mc:AlternateContent>
-      </w:r>
-      <w:r>
-        <w:rPr>
-          <w:rFonts w:ascii="微软雅黑" w:eastAsia="微软雅黑" w:hAnsi="微软雅黑"/>
-          <w:noProof/>
-        </w:rPr>
-        <mc:AlternateContent>
-          <mc:Choice Requires="wps">
-            <w:drawing>
-              <wp:anchor distT="0" distB="0" distL="114300" distR="114300" simplePos="0" relativeHeight="251725824" behindDoc="1" locked="0" layoutInCell="1" allowOverlap="1" wp14:anchorId="32FCE990" wp14:editId="62626F30">
-                <wp:simplePos x="0" y="0"/>
-                <wp:positionH relativeFrom="column">
-                  <wp:posOffset>-777877</wp:posOffset>
-                </wp:positionH>
-                <wp:positionV relativeFrom="paragraph">
-                  <wp:posOffset>-447002</wp:posOffset>
-                </wp:positionV>
-                <wp:extent cx="7709535" cy="2566438"/>
-                <wp:effectExtent l="0" t="0" r="24765" b="43815"/>
-                <wp:wrapNone/>
-                <wp:docPr id="62" name="流程图: 手动输入 2"/>
-                <wp:cNvGraphicFramePr/>
-                <a:graphic xmlns:a="http://schemas.openxmlformats.org/drawingml/2006/main">
-                  <a:graphicData uri="http://schemas.microsoft.com/office/word/2010/wordprocessingShape">
-                    <wps:wsp>
-                      <wps:cNvSpPr/>
-                      <wps:spPr>
-                        <a:xfrm rot="10800000" flipH="1">
-                          <a:off x="0" y="0"/>
-                          <a:ext cx="7709535" cy="2566438"/>
-                        </a:xfrm>
-                        <a:custGeom>
-                          <a:avLst/>
-                          <a:gdLst>
-                            <a:gd name="connsiteX0" fmla="*/ 0 w 10000"/>
-                            <a:gd name="connsiteY0" fmla="*/ 3036 h 10000"/>
-                            <a:gd name="connsiteX1" fmla="*/ 10000 w 10000"/>
-                            <a:gd name="connsiteY1" fmla="*/ 0 h 10000"/>
-                            <a:gd name="connsiteX2" fmla="*/ 10000 w 10000"/>
-                            <a:gd name="connsiteY2" fmla="*/ 10000 h 10000"/>
-                            <a:gd name="connsiteX3" fmla="*/ 0 w 10000"/>
-                            <a:gd name="connsiteY3" fmla="*/ 10000 h 10000"/>
-                            <a:gd name="connsiteX4" fmla="*/ 0 w 10000"/>
-                            <a:gd name="connsiteY4" fmla="*/ 3036 h 10000"/>
-                          </a:gdLst>
-                          <a:ahLst/>
-                          <a:cxnLst>
-                            <a:cxn ang="0">
-                              <a:pos x="connsiteX0" y="connsiteY0"/>
-                            </a:cxn>
-                            <a:cxn ang="0">
-                              <a:pos x="connsiteX1" y="connsiteY1"/>
-                            </a:cxn>
-                            <a:cxn ang="0">
-                              <a:pos x="connsiteX2" y="connsiteY2"/>
-                            </a:cxn>
-                            <a:cxn ang="0">
-                              <a:pos x="connsiteX3" y="connsiteY3"/>
-                            </a:cxn>
-                            <a:cxn ang="0">
-                              <a:pos x="connsiteX4" y="connsiteY4"/>
-                            </a:cxn>
-                          </a:cxnLst>
-                          <a:rect l="l" t="t" r="r" b="b"/>
-                          <a:pathLst>
-                            <a:path w="10000" h="10000">
-                              <a:moveTo>
-                                <a:pt x="0" y="3036"/>
-                              </a:moveTo>
-                              <a:lnTo>
-                                <a:pt x="10000" y="0"/>
-                              </a:lnTo>
-                              <a:lnTo>
-                                <a:pt x="10000" y="10000"/>
-                              </a:lnTo>
-                              <a:lnTo>
-                                <a:pt x="0" y="10000"/>
-                              </a:lnTo>
-                              <a:lnTo>
-                                <a:pt x="0" y="3036"/>
-                              </a:lnTo>
-                              <a:close/>
-                            </a:path>
-                          </a:pathLst>
-                        </a:custGeom>
-                        <a:solidFill>
-                          <a:srgbClr val="5290BF"/>
-                        </a:solidFill>
-                        <a:ln w="12700" cap="flat" cmpd="sng" algn="ctr">
-                          <a:solidFill>
-                            <a:srgbClr val="5290BF"/>
-                          </a:solidFill>
-                          <a:prstDash val="solid"/>
-                          <a:miter lim="800000"/>
-                        </a:ln>
-                        <a:effectLst/>
-                      </wps:spPr>
-                      <wps:bodyPr rot="0" spcFirstLastPara="0" vertOverflow="overflow" horzOverflow="overflow" vert="horz" wrap="square" lIns="91440" tIns="45720" rIns="91440" bIns="45720" numCol="1" spcCol="0" rtlCol="0" fromWordArt="0" anchor="ctr" anchorCtr="0" forceAA="0" compatLnSpc="1">
-                        <a:noAutofit/>
-                      </wps:bodyPr>
-                    </wps:wsp>
-                  </a:graphicData>
-                </a:graphic>
-                <wp14:sizeRelH relativeFrom="margin">
-                  <wp14:pctWidth>0</wp14:pctWidth>
-                </wp14:sizeRelH>
-                <wp14:sizeRelV relativeFrom="margin">
-                  <wp14:pctHeight>0</wp14:pctHeight>
-                </wp14:sizeRelV>
-              </wp:anchor>
-            </w:drawing>
-          </mc:Choice>
-          <mc:Fallback>
-            <w:pict>
-              <v:shape w14:anchorId="6CE1AFC6" id="流程图: 手动输入 2" o:spid="_x0000_s1026" style="position:absolute;margin-left:-61.25pt;margin-top:-35.2pt;width:607.05pt;height:202.1pt;rotation:180;flip:x;z-index:-251590656;visibility:visible;mso-wrap-style:square;mso-width-percent:0;mso-height-percent:0;mso-wrap-distance-left:9pt;mso-wrap-distance-top:0;mso-wrap-distance-right:9pt;mso-wrap-distance-bottom:0;mso-position-horizontal:absolute;mso-position-horizontal-relative:text;mso-position-vertical:absolute;mso-position-vertical-relative:text;mso-width-percent:0;mso-height-percent:0;mso-width-relative:margin;mso-height-relative:margin;v-text-anchor:middle" coordsize="10000,10000" o:gfxdata="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" path="m,3036l10000,r,10000l,10000,,3036xe" fillcolor="#5290bf" strokecolor="#5290bf" strokeweight="1pt">
-                <v:stroke joinstyle="miter"/>
-                <v:path arrowok="t" o:connecttype="custom" o:connectlocs="0,779171;7709535,0;7709535,2566438;0,2566438;0,779171" o:connectangles="0,0,0,0,0"/>
               </v:shape>
             </w:pict>
           </mc:Fallback>
@@ -1331,12 +1331,6 @@
           <w:rFonts w:ascii="微软雅黑" w:eastAsia="微软雅黑" w:hAnsi="微软雅黑" w:hint="eastAsia"/>
         </w:rPr>
       </w:pPr>
-      <w:r>
-        <w:rPr>
-          <w:rFonts w:ascii="微软雅黑" w:eastAsia="微软雅黑" w:hAnsi="微软雅黑"/>
-        </w:rPr>
-        <w:tab/>
-      </w:r>
     </w:p>
     <w:p>
       <w:pPr>
@@ -2214,7 +2208,16 @@
                                       <w:sz w:val="28"/>
                                       <w:szCs w:val="28"/>
                                     </w:rPr>
-                                    <w:t>（有二级证书）</w:t>
+                                    <w:t>（</w:t>
+                                  </w:r>
+                                  <w:r>
+                                    <w:rPr>
+                                      <w:rFonts w:ascii="微软雅黑" w:eastAsia="微软雅黑" w:hAnsi="微软雅黑" w:hint="eastAsia"/>
+                                      <w:color w:val="7F7F7F" w:themeColor="text1" w:themeTint="80"/>
+                                      <w:sz w:val="28"/>
+                                      <w:szCs w:val="28"/>
+                                    </w:rPr>
+                                    <w:t>有二级证书）</w:t>
                                   </w:r>
                                 </w:p>
                                 <w:p>
@@ -2376,15 +2379,6 @@
                                       <w:szCs w:val="28"/>
                                     </w:rPr>
                                     <w:t>Altium Designer</w:t>
-                                  </w:r>
-                                  <w:r>
-                                    <w:rPr>
-                                      <w:rFonts w:ascii="微软雅黑" w:eastAsia="微软雅黑" w:hAnsi="微软雅黑" w:hint="eastAsia"/>
-                                      <w:color w:val="7F7F7F" w:themeColor="text1" w:themeTint="80"/>
-                                      <w:sz w:val="28"/>
-                                      <w:szCs w:val="28"/>
-                                    </w:rPr>
-                                    <w:t xml:space="preserve"> （简单的 PCB）</w:t>
                                   </w:r>
                                 </w:p>
                                 <w:p>
@@ -3685,7 +3679,9 @@
                                     <w:spacing w:line="360" w:lineRule="exact"/>
                                     <w:rPr>
                                       <w:rFonts w:ascii="微软雅黑" w:eastAsia="微软雅黑" w:hAnsi="微软雅黑" w:hint="eastAsia"/>
-                                      <w:color w:val="7F7F7F" w:themeColor="text1" w:themeTint="80"/>
+                                      <w:b/>
+                                      <w:bCs/>
+                                      <w:color w:val="595959" w:themeColor="text1" w:themeTint="A6"/>
                                       <w:sz w:val="24"/>
                                       <w:szCs w:val="24"/>
                                     </w:rPr>
@@ -3697,16 +3693,7 @@
                                       <w:sz w:val="24"/>
                                       <w:szCs w:val="24"/>
                                     </w:rPr>
-                                    <w:t>江苏省</w:t>
-                                  </w:r>
-                                  <w:r>
-                                    <w:rPr>
-                                      <w:rFonts w:ascii="微软雅黑" w:eastAsia="微软雅黑" w:hAnsi="微软雅黑" w:hint="eastAsia"/>
-                                      <w:color w:val="7F7F7F" w:themeColor="text1" w:themeTint="80"/>
-                                      <w:sz w:val="24"/>
-                                      <w:szCs w:val="24"/>
-                                    </w:rPr>
-                                    <w:t>南京市江宁区</w:t>
+                                    <w:t>贵州省遵义市仁怀市</w:t>
                                   </w:r>
                                 </w:p>
                               </w:txbxContent>
@@ -3926,7 +3913,7 @@
                                       <w:sz w:val="24"/>
                                       <w:szCs w:val="24"/>
                                     </w:rPr>
-                                    <w:t>共青团员</w:t>
+                                    <w:t>群众</w:t>
                                   </w:r>
                                 </w:p>
                               </w:txbxContent>
@@ -4618,7 +4605,16 @@
                                 <w:sz w:val="28"/>
                                 <w:szCs w:val="28"/>
                               </w:rPr>
-                              <w:t>（有二级证书）</w:t>
+                              <w:t>（</w:t>
+                            </w:r>
+                            <w:r>
+                              <w:rPr>
+                                <w:rFonts w:ascii="微软雅黑" w:eastAsia="微软雅黑" w:hAnsi="微软雅黑" w:hint="eastAsia"/>
+                                <w:color w:val="7F7F7F" w:themeColor="text1" w:themeTint="80"/>
+                                <w:sz w:val="28"/>
+                                <w:szCs w:val="28"/>
+                              </w:rPr>
+                              <w:t>有二级证书）</w:t>
                             </w:r>
                           </w:p>
                           <w:p>
@@ -4780,15 +4776,6 @@
                                 <w:szCs w:val="28"/>
                               </w:rPr>
                               <w:t>Altium Designer</w:t>
-                            </w:r>
-                            <w:r>
-                              <w:rPr>
-                                <w:rFonts w:ascii="微软雅黑" w:eastAsia="微软雅黑" w:hAnsi="微软雅黑" w:hint="eastAsia"/>
-                                <w:color w:val="7F7F7F" w:themeColor="text1" w:themeTint="80"/>
-                                <w:sz w:val="28"/>
-                                <w:szCs w:val="28"/>
-                              </w:rPr>
-                              <w:t xml:space="preserve"> （简单的 PCB）</w:t>
                             </w:r>
                           </w:p>
                           <w:p>
@@ -4992,7 +4979,9 @@
                               <w:spacing w:line="360" w:lineRule="exact"/>
                               <w:rPr>
                                 <w:rFonts w:ascii="微软雅黑" w:eastAsia="微软雅黑" w:hAnsi="微软雅黑" w:hint="eastAsia"/>
-                                <w:color w:val="7F7F7F" w:themeColor="text1" w:themeTint="80"/>
+                                <w:b/>
+                                <w:bCs/>
+                                <w:color w:val="595959" w:themeColor="text1" w:themeTint="A6"/>
                                 <w:sz w:val="24"/>
                                 <w:szCs w:val="24"/>
                               </w:rPr>
@@ -5004,16 +4993,7 @@
                                 <w:sz w:val="24"/>
                                 <w:szCs w:val="24"/>
                               </w:rPr>
-                              <w:t>江苏省</w:t>
-                            </w:r>
-                            <w:r>
-                              <w:rPr>
-                                <w:rFonts w:ascii="微软雅黑" w:eastAsia="微软雅黑" w:hAnsi="微软雅黑" w:hint="eastAsia"/>
-                                <w:color w:val="7F7F7F" w:themeColor="text1" w:themeTint="80"/>
-                                <w:sz w:val="24"/>
-                                <w:szCs w:val="24"/>
-                              </w:rPr>
-                              <w:t>南京市江宁区</w:t>
+                              <w:t>贵州省遵义市仁怀市</w:t>
                             </w:r>
                           </w:p>
                         </w:txbxContent>
@@ -5129,7 +5109,7 @@
                                 <w:sz w:val="24"/>
                                 <w:szCs w:val="24"/>
                               </w:rPr>
-                              <w:t>共青团员</w:t>
+                              <w:t>群众</w:t>
                             </w:r>
                           </w:p>
                         </w:txbxContent>
@@ -5885,7 +5865,7 @@
         <w:ind w:firstLineChars="0"/>
         <w:jc w:val="left"/>
         <w:rPr>
-          <w:rFonts w:ascii="微软雅黑" w:eastAsia="微软雅黑" w:hAnsi="微软雅黑"/>
+          <w:rFonts w:ascii="微软雅黑" w:eastAsia="微软雅黑" w:hAnsi="微软雅黑" w:hint="eastAsia"/>
           <w:color w:val="595959" w:themeColor="text1" w:themeTint="A6"/>
           <w:sz w:val="22"/>
         </w:rPr>
@@ -5896,15 +5876,7 @@
           <w:color w:val="595959" w:themeColor="text1" w:themeTint="A6"/>
           <w:sz w:val="22"/>
         </w:rPr>
-        <w:t>熟悉使用</w:t>
-      </w:r>
-      <w:r>
-        <w:rPr>
-          <w:rFonts w:ascii="微软雅黑" w:eastAsia="微软雅黑" w:hAnsi="微软雅黑" w:hint="eastAsia"/>
-          <w:color w:val="595959" w:themeColor="text1" w:themeTint="A6"/>
-          <w:sz w:val="22"/>
-        </w:rPr>
-        <w:t>CAD</w:t>
+        <w:t>熟悉使用CAD</w:t>
       </w:r>
       <w:r>
         <w:rPr>
@@ -5945,7 +5917,7 @@
         <w:ind w:firstLineChars="0"/>
         <w:jc w:val="left"/>
         <w:rPr>
-          <w:rFonts w:ascii="微软雅黑" w:eastAsia="微软雅黑" w:hAnsi="微软雅黑"/>
+          <w:rFonts w:ascii="微软雅黑" w:eastAsia="微软雅黑" w:hAnsi="微软雅黑" w:hint="eastAsia"/>
           <w:color w:val="595959" w:themeColor="text1" w:themeTint="A6"/>
           <w:sz w:val="22"/>
         </w:rPr>
@@ -6013,7 +5985,7 @@
         <w:ind w:firstLineChars="0"/>
         <w:jc w:val="left"/>
         <w:rPr>
-          <w:rFonts w:ascii="微软雅黑" w:eastAsia="微软雅黑" w:hAnsi="微软雅黑"/>
+          <w:rFonts w:ascii="微软雅黑" w:eastAsia="微软雅黑" w:hAnsi="微软雅黑" w:hint="eastAsia"/>
           <w:color w:val="595959" w:themeColor="text1" w:themeTint="A6"/>
           <w:sz w:val="22"/>
         </w:rPr>
@@ -6034,6 +6006,30 @@
         </w:rPr>
         <w:t xml:space="preserve">NB UDP TCP CoAP </w:t>
       </w:r>
+      <w:r>
+        <w:rPr>
+          <w:rFonts w:ascii="微软雅黑" w:eastAsia="微软雅黑" w:hAnsi="微软雅黑" w:hint="eastAsia"/>
+          <w:color w:val="595959" w:themeColor="text1" w:themeTint="A6"/>
+          <w:sz w:val="22"/>
+        </w:rPr>
+        <w:t>MQTT</w:t>
+      </w:r>
+      <w:r>
+        <w:rPr>
+          <w:rFonts w:ascii="微软雅黑" w:eastAsia="微软雅黑" w:hAnsi="微软雅黑" w:hint="eastAsia"/>
+          <w:color w:val="595959" w:themeColor="text1" w:themeTint="A6"/>
+          <w:sz w:val="22"/>
+        </w:rPr>
+        <w:t xml:space="preserve"> </w:t>
+      </w:r>
+      <w:r>
+        <w:rPr>
+          <w:rFonts w:ascii="微软雅黑" w:eastAsia="微软雅黑" w:hAnsi="微软雅黑" w:hint="eastAsia"/>
+          <w:color w:val="595959" w:themeColor="text1" w:themeTint="A6"/>
+          <w:sz w:val="22"/>
+        </w:rPr>
+        <w:t>等协议连过</w:t>
+      </w:r>
       <w:proofErr w:type="spellStart"/>
       <w:r>
         <w:rPr>
@@ -6041,7 +6037,7 @@
           <w:color w:val="595959" w:themeColor="text1" w:themeTint="A6"/>
           <w:sz w:val="22"/>
         </w:rPr>
-        <w:t>mqtt</w:t>
+        <w:t>CTWing</w:t>
       </w:r>
       <w:proofErr w:type="spellEnd"/>
       <w:r>
@@ -6052,14 +6048,6 @@
         </w:rPr>
         <w:t xml:space="preserve"> </w:t>
       </w:r>
-      <w:r>
-        <w:rPr>
-          <w:rFonts w:ascii="微软雅黑" w:eastAsia="微软雅黑" w:hAnsi="微软雅黑" w:hint="eastAsia"/>
-          <w:color w:val="595959" w:themeColor="text1" w:themeTint="A6"/>
-          <w:sz w:val="22"/>
-        </w:rPr>
-        <w:t>等协议连过</w:t>
-      </w:r>
       <w:proofErr w:type="spellStart"/>
       <w:r>
         <w:rPr>
@@ -6067,7 +6055,7 @@
           <w:color w:val="595959" w:themeColor="text1" w:themeTint="A6"/>
           <w:sz w:val="22"/>
         </w:rPr>
-        <w:t>CTWing</w:t>
+        <w:t>OneNET</w:t>
       </w:r>
       <w:proofErr w:type="spellEnd"/>
       <w:r>
@@ -6078,23 +6066,13 @@
         </w:rPr>
         <w:t xml:space="preserve"> </w:t>
       </w:r>
-      <w:proofErr w:type="spellStart"/>
-      <w:r>
-        <w:rPr>
-          <w:rFonts w:ascii="微软雅黑" w:eastAsia="微软雅黑" w:hAnsi="微软雅黑" w:hint="eastAsia"/>
-          <w:color w:val="595959" w:themeColor="text1" w:themeTint="A6"/>
-          <w:sz w:val="22"/>
-        </w:rPr>
-        <w:t>OneNET</w:t>
-      </w:r>
-      <w:proofErr w:type="spellEnd"/>
-      <w:r>
-        <w:rPr>
-          <w:rFonts w:ascii="微软雅黑" w:eastAsia="微软雅黑" w:hAnsi="微软雅黑" w:hint="eastAsia"/>
-          <w:color w:val="595959" w:themeColor="text1" w:themeTint="A6"/>
-          <w:sz w:val="22"/>
-        </w:rPr>
-        <w:t xml:space="preserve"> </w:t>
+      <w:r>
+        <w:rPr>
+          <w:rFonts w:ascii="微软雅黑" w:eastAsia="微软雅黑" w:hAnsi="微软雅黑" w:hint="eastAsia"/>
+          <w:color w:val="595959" w:themeColor="text1" w:themeTint="A6"/>
+          <w:sz w:val="22"/>
+        </w:rPr>
+        <w:t>平台</w:t>
       </w:r>
       <w:r>
         <w:rPr>
@@ -6198,39 +6176,7 @@
           <w:color w:val="595959" w:themeColor="text1" w:themeTint="A6"/>
           <w:sz w:val="22"/>
         </w:rPr>
-        <w:t>开发的，</w:t>
-      </w:r>
-      <w:r>
-        <w:rPr>
-          <w:rFonts w:ascii="微软雅黑" w:eastAsia="微软雅黑" w:hAnsi="微软雅黑" w:hint="eastAsia"/>
-          <w:color w:val="595959" w:themeColor="text1" w:themeTint="A6"/>
-          <w:sz w:val="22"/>
-        </w:rPr>
-        <w:t>使用 RS485 RS232 MBUS 等</w:t>
-      </w:r>
-      <w:r>
-        <w:rPr>
-          <w:rFonts w:ascii="微软雅黑" w:eastAsia="微软雅黑" w:hAnsi="微软雅黑" w:hint="eastAsia"/>
-          <w:color w:val="595959" w:themeColor="text1" w:themeTint="A6"/>
-          <w:sz w:val="22"/>
-        </w:rPr>
-        <w:t>协议</w:t>
-      </w:r>
-      <w:r>
-        <w:rPr>
-          <w:rFonts w:ascii="微软雅黑" w:eastAsia="微软雅黑" w:hAnsi="微软雅黑" w:hint="eastAsia"/>
-          <w:color w:val="595959" w:themeColor="text1" w:themeTint="A6"/>
-          <w:sz w:val="22"/>
-        </w:rPr>
-        <w:t>通信</w:t>
-      </w:r>
-      <w:r>
-        <w:rPr>
-          <w:rFonts w:ascii="微软雅黑" w:eastAsia="微软雅黑" w:hAnsi="微软雅黑" w:hint="eastAsia"/>
-          <w:color w:val="595959" w:themeColor="text1" w:themeTint="A6"/>
-          <w:sz w:val="22"/>
-        </w:rPr>
-        <w:t>的数据采集设备</w:t>
+        <w:t>开发的，使用 RS485 RS232 MBUS 等协议通信的数据采集设备</w:t>
       </w:r>
     </w:p>
     <w:p>
@@ -6245,7 +6191,7 @@
         <w:ind w:firstLineChars="0"/>
         <w:jc w:val="left"/>
         <w:rPr>
-          <w:rFonts w:ascii="微软雅黑" w:eastAsia="微软雅黑" w:hAnsi="微软雅黑"/>
+          <w:rFonts w:ascii="微软雅黑" w:eastAsia="微软雅黑" w:hAnsi="微软雅黑" w:hint="eastAsia"/>
           <w:color w:val="595959" w:themeColor="text1" w:themeTint="A6"/>
           <w:sz w:val="22"/>
         </w:rPr>
@@ -6290,32 +6236,10 @@
           <w:color w:val="595959" w:themeColor="text1" w:themeTint="A6"/>
           <w:sz w:val="22"/>
         </w:rPr>
-        <w:t xml:space="preserve"> 协议和 </w:t>
-      </w:r>
-      <w:r>
-        <w:rPr>
-          <w:rFonts w:ascii="微软雅黑" w:eastAsia="微软雅黑" w:hAnsi="微软雅黑" w:hint="eastAsia"/>
-          <w:color w:val="595959" w:themeColor="text1" w:themeTint="A6"/>
-          <w:sz w:val="22"/>
-        </w:rPr>
-        <w:t>JavaScript</w:t>
-      </w:r>
-      <w:r>
-        <w:rPr>
-          <w:rFonts w:ascii="微软雅黑" w:eastAsia="微软雅黑" w:hAnsi="微软雅黑" w:hint="eastAsia"/>
-          <w:color w:val="595959" w:themeColor="text1" w:themeTint="A6"/>
-          <w:sz w:val="22"/>
-        </w:rPr>
-        <w:t xml:space="preserve"> 语法</w:t>
+        <w:t xml:space="preserve"> 协议和 JavaScript 语法</w:t>
       </w:r>
     </w:p>
-    <w:p>
-      <w:pPr>
-        <w:rPr>
-          <w:rFonts w:hint="eastAsia"/>
-        </w:rPr>
-      </w:pPr>
-    </w:p>
+    <w:p/>
     <w:p>
       <w:pPr>
         <w:pStyle w:val="1"/>
@@ -6754,10 +6678,53 @@
     </w:p>
     <w:p>
       <w:pPr>
-        <w:rPr>
-          <w:rFonts w:hint="eastAsia"/>
+        <w:pStyle w:val="aa"/>
+        <w:numPr>
+          <w:ilvl w:val="0"/>
+          <w:numId w:val="3"/>
+        </w:numPr>
+        <w:snapToGrid w:val="0"/>
+        <w:spacing w:line="360" w:lineRule="exact"/>
+        <w:ind w:firstLineChars="0"/>
+        <w:jc w:val="left"/>
+        <w:rPr>
+          <w:rFonts w:ascii="微软雅黑" w:eastAsia="微软雅黑" w:hAnsi="微软雅黑" w:hint="eastAsia"/>
+          <w:color w:val="595959" w:themeColor="text1" w:themeTint="A6"/>
+          <w:sz w:val="22"/>
         </w:rPr>
       </w:pPr>
+      <w:r>
+        <w:rPr>
+          <w:rFonts w:ascii="微软雅黑" w:eastAsia="微软雅黑" w:hAnsi="微软雅黑" w:hint="eastAsia"/>
+          <w:color w:val="595959" w:themeColor="text1" w:themeTint="A6"/>
+          <w:sz w:val="22"/>
+        </w:rPr>
+        <w:t>依据</w:t>
+      </w:r>
+      <w:r>
+        <w:rPr>
+          <w:rFonts w:ascii="微软雅黑" w:eastAsia="微软雅黑" w:hAnsi="微软雅黑" w:hint="eastAsia"/>
+          <w:color w:val="595959" w:themeColor="text1" w:themeTint="A6"/>
+          <w:sz w:val="22"/>
+        </w:rPr>
+        <w:t>不同通信协议（LwM2M，UDP，TCP，CoAP ）</w:t>
+      </w:r>
+      <w:r>
+        <w:rPr>
+          <w:rFonts w:ascii="微软雅黑" w:eastAsia="微软雅黑" w:hAnsi="微软雅黑" w:hint="eastAsia"/>
+          <w:color w:val="595959" w:themeColor="text1" w:themeTint="A6"/>
+          <w:sz w:val="22"/>
+        </w:rPr>
+        <w:t>采集并传输数据</w:t>
+      </w:r>
+      <w:r>
+        <w:rPr>
+          <w:rFonts w:ascii="微软雅黑" w:eastAsia="微软雅黑" w:hAnsi="微软雅黑" w:hint="eastAsia"/>
+          <w:color w:val="595959" w:themeColor="text1" w:themeTint="A6"/>
+          <w:sz w:val="22"/>
+        </w:rPr>
+        <w:t>的 NB 超声波水表</w:t>
+      </w:r>
     </w:p>
     <w:p>
       <w:pPr>
@@ -6782,31 +6749,23 @@
           <w:color w:val="595959" w:themeColor="text1" w:themeTint="A6"/>
           <w:sz w:val="22"/>
         </w:rPr>
-        <w:t>依据</w:t>
-      </w:r>
-      <w:r>
-        <w:rPr>
-          <w:rFonts w:ascii="微软雅黑" w:eastAsia="微软雅黑" w:hAnsi="微软雅黑" w:hint="eastAsia"/>
-          <w:color w:val="595959" w:themeColor="text1" w:themeTint="A6"/>
-          <w:sz w:val="22"/>
-        </w:rPr>
-        <w:t>不同通信协议（LwM2M，UDP，TCP，CoAP ）</w:t>
-      </w:r>
-      <w:r>
-        <w:rPr>
-          <w:rFonts w:ascii="微软雅黑" w:eastAsia="微软雅黑" w:hAnsi="微软雅黑" w:hint="eastAsia"/>
-          <w:color w:val="595959" w:themeColor="text1" w:themeTint="A6"/>
-          <w:sz w:val="22"/>
-        </w:rPr>
-        <w:t>采集并传输数据</w:t>
-      </w:r>
-      <w:r>
-        <w:rPr>
-          <w:rFonts w:ascii="微软雅黑" w:eastAsia="微软雅黑" w:hAnsi="微软雅黑" w:hint="eastAsia"/>
-          <w:color w:val="595959" w:themeColor="text1" w:themeTint="A6"/>
-          <w:sz w:val="22"/>
-        </w:rPr>
-        <w:t>的 NB 超声波水表</w:t>
+        <w:t>做过</w:t>
+      </w:r>
+      <w:r>
+        <w:rPr>
+          <w:rFonts w:ascii="微软雅黑" w:eastAsia="微软雅黑" w:hAnsi="微软雅黑" w:hint="eastAsia"/>
+          <w:color w:val="595959" w:themeColor="text1" w:themeTint="A6"/>
+          <w:sz w:val="22"/>
+        </w:rPr>
+        <w:t>一个</w:t>
+      </w:r>
+      <w:r>
+        <w:rPr>
+          <w:rFonts w:ascii="微软雅黑" w:eastAsia="微软雅黑" w:hAnsi="微软雅黑"/>
+          <w:color w:val="595959" w:themeColor="text1" w:themeTint="A6"/>
+          <w:sz w:val="22"/>
+        </w:rPr>
+        <w:t>电机的控制程序和一个基于霍尔元件的测试工具，用于计算 PWM 占空比和频率</w:t>
       </w:r>
     </w:p>
     <w:p>
@@ -6821,7 +6780,7 @@
         <w:ind w:firstLineChars="0"/>
         <w:jc w:val="left"/>
         <w:rPr>
-          <w:rFonts w:ascii="微软雅黑" w:eastAsia="微软雅黑" w:hAnsi="微软雅黑"/>
+          <w:rFonts w:ascii="微软雅黑" w:eastAsia="微软雅黑" w:hAnsi="微软雅黑" w:hint="eastAsia"/>
           <w:color w:val="595959" w:themeColor="text1" w:themeTint="A6"/>
           <w:sz w:val="22"/>
         </w:rPr>
@@ -6832,23 +6791,31 @@
           <w:color w:val="595959" w:themeColor="text1" w:themeTint="A6"/>
           <w:sz w:val="22"/>
         </w:rPr>
-        <w:t>做过</w:t>
-      </w:r>
-      <w:r>
-        <w:rPr>
-          <w:rFonts w:ascii="微软雅黑" w:eastAsia="微软雅黑" w:hAnsi="微软雅黑" w:hint="eastAsia"/>
-          <w:color w:val="595959" w:themeColor="text1" w:themeTint="A6"/>
-          <w:sz w:val="22"/>
-        </w:rPr>
-        <w:t>一个</w:t>
-      </w:r>
-      <w:r>
-        <w:rPr>
-          <w:rFonts w:ascii="微软雅黑" w:eastAsia="微软雅黑" w:hAnsi="微软雅黑"/>
-          <w:color w:val="595959" w:themeColor="text1" w:themeTint="A6"/>
-          <w:sz w:val="22"/>
-        </w:rPr>
-        <w:t>电机的控制程序和一个基于霍尔元件的测试工具，用于计算 PWM 占空比和频率</w:t>
+        <w:t>一种根据定时器</w:t>
+      </w:r>
+      <w:r>
+        <w:rPr>
+          <w:rFonts w:ascii="微软雅黑" w:eastAsia="微软雅黑" w:hAnsi="微软雅黑" w:hint="eastAsia"/>
+          <w:color w:val="595959" w:themeColor="text1" w:themeTint="A6"/>
+          <w:sz w:val="22"/>
+        </w:rPr>
+        <w:t>任务框架</w:t>
+      </w:r>
+      <w:r>
+        <w:rPr>
+          <w:rFonts w:ascii="微软雅黑" w:eastAsia="微软雅黑" w:hAnsi="微软雅黑" w:hint="eastAsia"/>
+          <w:color w:val="595959" w:themeColor="text1" w:themeTint="A6"/>
+          <w:sz w:val="22"/>
+        </w:rPr>
+        <w:t>实现的</w:t>
+      </w:r>
+      <w:r>
+        <w:rPr>
+          <w:rFonts w:ascii="微软雅黑" w:eastAsia="微软雅黑" w:hAnsi="微软雅黑" w:hint="eastAsia"/>
+          <w:color w:val="595959" w:themeColor="text1" w:themeTint="A6"/>
+          <w:sz w:val="22"/>
+        </w:rPr>
+        <w:t>串口接收机制</w:t>
       </w:r>
     </w:p>
     <w:p>
@@ -6863,7 +6830,7 @@
         <w:ind w:firstLineChars="0"/>
         <w:jc w:val="left"/>
         <w:rPr>
-          <w:rFonts w:ascii="微软雅黑" w:eastAsia="微软雅黑" w:hAnsi="微软雅黑"/>
+          <w:rFonts w:ascii="微软雅黑" w:eastAsia="微软雅黑" w:hAnsi="微软雅黑" w:hint="eastAsia"/>
           <w:color w:val="595959" w:themeColor="text1" w:themeTint="A6"/>
           <w:sz w:val="22"/>
         </w:rPr>
@@ -6874,32 +6841,92 @@
           <w:color w:val="595959" w:themeColor="text1" w:themeTint="A6"/>
           <w:sz w:val="22"/>
         </w:rPr>
-        <w:t>一种根据定时器</w:t>
-      </w:r>
-      <w:r>
-        <w:rPr>
-          <w:rFonts w:ascii="微软雅黑" w:eastAsia="微软雅黑" w:hAnsi="微软雅黑" w:hint="eastAsia"/>
-          <w:color w:val="595959" w:themeColor="text1" w:themeTint="A6"/>
-          <w:sz w:val="22"/>
-        </w:rPr>
-        <w:t>任务框架</w:t>
-      </w:r>
-      <w:r>
-        <w:rPr>
-          <w:rFonts w:ascii="微软雅黑" w:eastAsia="微软雅黑" w:hAnsi="微软雅黑" w:hint="eastAsia"/>
-          <w:color w:val="595959" w:themeColor="text1" w:themeTint="A6"/>
-          <w:sz w:val="22"/>
-        </w:rPr>
-        <w:t>实现的</w:t>
-      </w:r>
-      <w:r>
-        <w:rPr>
-          <w:rFonts w:ascii="微软雅黑" w:eastAsia="微软雅黑" w:hAnsi="微软雅黑" w:hint="eastAsia"/>
-          <w:color w:val="595959" w:themeColor="text1" w:themeTint="A6"/>
-          <w:sz w:val="22"/>
-        </w:rPr>
-        <w:t>串口接收机制</w:t>
-      </w:r>
+        <w:t>有过复杂项目</w:t>
+      </w:r>
+      <w:r>
+        <w:rPr>
+          <w:rFonts w:ascii="微软雅黑" w:eastAsia="微软雅黑" w:hAnsi="微软雅黑" w:hint="eastAsia"/>
+          <w:color w:val="595959" w:themeColor="text1" w:themeTint="A6"/>
+          <w:sz w:val="22"/>
+        </w:rPr>
+        <w:t>的</w:t>
+      </w:r>
+      <w:r>
+        <w:rPr>
+          <w:rFonts w:ascii="微软雅黑" w:eastAsia="微软雅黑" w:hAnsi="微软雅黑" w:hint="eastAsia"/>
+          <w:color w:val="595959" w:themeColor="text1" w:themeTint="A6"/>
+          <w:sz w:val="22"/>
+        </w:rPr>
+        <w:t>重构</w:t>
+      </w:r>
+      <w:r>
+        <w:rPr>
+          <w:rFonts w:ascii="微软雅黑" w:eastAsia="微软雅黑" w:hAnsi="微软雅黑" w:hint="eastAsia"/>
+          <w:color w:val="595959" w:themeColor="text1" w:themeTint="A6"/>
+          <w:sz w:val="22"/>
+        </w:rPr>
+        <w:t>经验</w:t>
+      </w:r>
+      <w:r>
+        <w:rPr>
+          <w:rFonts w:ascii="微软雅黑" w:eastAsia="微软雅黑" w:hAnsi="微软雅黑" w:hint="eastAsia"/>
+          <w:color w:val="595959" w:themeColor="text1" w:themeTint="A6"/>
+          <w:sz w:val="22"/>
+        </w:rPr>
+        <w:t>，为不同</w:t>
+      </w:r>
+      <w:r>
+        <w:rPr>
+          <w:rFonts w:ascii="微软雅黑" w:eastAsia="微软雅黑" w:hAnsi="微软雅黑" w:hint="eastAsia"/>
+          <w:color w:val="595959" w:themeColor="text1" w:themeTint="A6"/>
+          <w:sz w:val="22"/>
+        </w:rPr>
+        <w:t>NB 模组</w:t>
+      </w:r>
+      <w:r>
+        <w:rPr>
+          <w:rFonts w:ascii="微软雅黑" w:eastAsia="微软雅黑" w:hAnsi="微软雅黑" w:hint="eastAsia"/>
+          <w:color w:val="595959" w:themeColor="text1" w:themeTint="A6"/>
+          <w:sz w:val="22"/>
+        </w:rPr>
+        <w:t>设计过通用的运行框架，将一个高耦合的程序，</w:t>
+      </w:r>
+      <w:proofErr w:type="gramStart"/>
+      <w:r>
+        <w:rPr>
+          <w:rFonts w:ascii="微软雅黑" w:eastAsia="微软雅黑" w:hAnsi="微软雅黑" w:hint="eastAsia"/>
+          <w:color w:val="595959" w:themeColor="text1" w:themeTint="A6"/>
+          <w:sz w:val="22"/>
+        </w:rPr>
+        <w:t>通过对模组</w:t>
+      </w:r>
+      <w:proofErr w:type="gramEnd"/>
+      <w:r>
+        <w:rPr>
+          <w:rFonts w:ascii="微软雅黑" w:eastAsia="微软雅黑" w:hAnsi="微软雅黑" w:hint="eastAsia"/>
+          <w:color w:val="595959" w:themeColor="text1" w:themeTint="A6"/>
+          <w:sz w:val="22"/>
+        </w:rPr>
+        <w:t>的抽象，和对应接口的设计实现统一的调用方式，将项目模块化结构化</w:t>
+      </w:r>
+      <w:r>
+        <w:rPr>
+          <w:rFonts w:ascii="微软雅黑" w:eastAsia="微软雅黑" w:hAnsi="微软雅黑" w:hint="eastAsia"/>
+          <w:color w:val="595959" w:themeColor="text1" w:themeTint="A6"/>
+          <w:sz w:val="22"/>
+        </w:rPr>
+        <w:t>，提供不同模组的通用性</w:t>
+      </w:r>
+      <w:proofErr w:type="spellStart"/>
+      <w:r>
+        <w:rPr>
+          <w:rFonts w:ascii="微软雅黑" w:eastAsia="微软雅黑" w:hAnsi="微软雅黑" w:hint="eastAsia"/>
+          <w:color w:val="595959" w:themeColor="text1" w:themeTint="A6"/>
+          <w:sz w:val="22"/>
+        </w:rPr>
+        <w:t>api</w:t>
+      </w:r>
+      <w:proofErr w:type="spellEnd"/>
     </w:p>
     <w:p>
       <w:pPr>
@@ -6913,7 +6940,7 @@
         <w:ind w:firstLineChars="0"/>
         <w:jc w:val="left"/>
         <w:rPr>
-          <w:rFonts w:ascii="微软雅黑" w:eastAsia="微软雅黑" w:hAnsi="微软雅黑"/>
+          <w:rFonts w:ascii="微软雅黑" w:eastAsia="微软雅黑" w:hAnsi="微软雅黑" w:hint="eastAsia"/>
           <w:color w:val="595959" w:themeColor="text1" w:themeTint="A6"/>
           <w:sz w:val="22"/>
         </w:rPr>
@@ -6924,96 +6951,24 @@
           <w:color w:val="595959" w:themeColor="text1" w:themeTint="A6"/>
           <w:sz w:val="22"/>
         </w:rPr>
-        <w:t>有过复杂项目</w:t>
-      </w:r>
-      <w:r>
-        <w:rPr>
-          <w:rFonts w:ascii="微软雅黑" w:eastAsia="微软雅黑" w:hAnsi="微软雅黑" w:hint="eastAsia"/>
-          <w:color w:val="595959" w:themeColor="text1" w:themeTint="A6"/>
-          <w:sz w:val="22"/>
-        </w:rPr>
-        <w:t>的</w:t>
-      </w:r>
-      <w:r>
-        <w:rPr>
-          <w:rFonts w:ascii="微软雅黑" w:eastAsia="微软雅黑" w:hAnsi="微软雅黑" w:hint="eastAsia"/>
-          <w:color w:val="595959" w:themeColor="text1" w:themeTint="A6"/>
-          <w:sz w:val="22"/>
-        </w:rPr>
-        <w:t>重构</w:t>
-      </w:r>
-      <w:r>
-        <w:rPr>
-          <w:rFonts w:ascii="微软雅黑" w:eastAsia="微软雅黑" w:hAnsi="微软雅黑" w:hint="eastAsia"/>
-          <w:color w:val="595959" w:themeColor="text1" w:themeTint="A6"/>
-          <w:sz w:val="22"/>
-        </w:rPr>
-        <w:t>经验</w:t>
-      </w:r>
-      <w:r>
-        <w:rPr>
-          <w:rFonts w:ascii="微软雅黑" w:eastAsia="微软雅黑" w:hAnsi="微软雅黑" w:hint="eastAsia"/>
-          <w:color w:val="595959" w:themeColor="text1" w:themeTint="A6"/>
-          <w:sz w:val="22"/>
-        </w:rPr>
-        <w:t>，为不同</w:t>
-      </w:r>
-      <w:r>
-        <w:rPr>
-          <w:rFonts w:ascii="微软雅黑" w:eastAsia="微软雅黑" w:hAnsi="微软雅黑" w:hint="eastAsia"/>
-          <w:color w:val="595959" w:themeColor="text1" w:themeTint="A6"/>
-          <w:sz w:val="22"/>
-        </w:rPr>
-        <w:t>NB 模组</w:t>
-      </w:r>
-      <w:r>
-        <w:rPr>
-          <w:rFonts w:ascii="微软雅黑" w:eastAsia="微软雅黑" w:hAnsi="微软雅黑" w:hint="eastAsia"/>
-          <w:color w:val="595959" w:themeColor="text1" w:themeTint="A6"/>
-          <w:sz w:val="22"/>
-        </w:rPr>
-        <w:t>设计过通用的运行框架，将一个高耦合的程序，</w:t>
-      </w:r>
-      <w:proofErr w:type="gramStart"/>
-      <w:r>
-        <w:rPr>
-          <w:rFonts w:ascii="微软雅黑" w:eastAsia="微软雅黑" w:hAnsi="微软雅黑" w:hint="eastAsia"/>
-          <w:color w:val="595959" w:themeColor="text1" w:themeTint="A6"/>
-          <w:sz w:val="22"/>
-        </w:rPr>
-        <w:t>通过对模组</w:t>
-      </w:r>
-      <w:proofErr w:type="gramEnd"/>
-      <w:r>
-        <w:rPr>
-          <w:rFonts w:ascii="微软雅黑" w:eastAsia="微软雅黑" w:hAnsi="微软雅黑" w:hint="eastAsia"/>
-          <w:color w:val="595959" w:themeColor="text1" w:themeTint="A6"/>
-          <w:sz w:val="22"/>
-        </w:rPr>
-        <w:t>的抽象，和对应接口的设计实现统一的调用方式，将项目模块化结构化</w:t>
-      </w:r>
-      <w:r>
-        <w:rPr>
-          <w:rFonts w:ascii="微软雅黑" w:eastAsia="微软雅黑" w:hAnsi="微软雅黑" w:hint="eastAsia"/>
-          <w:color w:val="595959" w:themeColor="text1" w:themeTint="A6"/>
-          <w:sz w:val="22"/>
-        </w:rPr>
-        <w:t>，提供不同模组的通用性</w:t>
-      </w:r>
-    </w:p>
-    <w:p>
-      <w:pPr>
-        <w:pStyle w:val="aa"/>
-        <w:snapToGrid w:val="0"/>
-        <w:spacing w:line="360" w:lineRule="exact"/>
-        <w:ind w:left="440" w:firstLineChars="0" w:firstLine="0"/>
-        <w:jc w:val="left"/>
-        <w:rPr>
-          <w:rFonts w:ascii="微软雅黑" w:eastAsia="微软雅黑" w:hAnsi="微软雅黑" w:hint="eastAsia"/>
-          <w:color w:val="595959" w:themeColor="text1" w:themeTint="A6"/>
-          <w:sz w:val="22"/>
-        </w:rPr>
-      </w:pPr>
+        <w:t>参与</w:t>
+      </w:r>
+      <w:r>
+        <w:rPr>
+          <w:rFonts w:ascii="微软雅黑" w:eastAsia="微软雅黑" w:hAnsi="微软雅黑" w:hint="eastAsia"/>
+          <w:color w:val="595959" w:themeColor="text1" w:themeTint="A6"/>
+          <w:sz w:val="22"/>
+        </w:rPr>
+        <w:t>制定</w:t>
+      </w:r>
+      <w:r>
+        <w:rPr>
+          <w:rFonts w:ascii="微软雅黑" w:eastAsia="微软雅黑" w:hAnsi="微软雅黑" w:hint="eastAsia"/>
+          <w:color w:val="595959" w:themeColor="text1" w:themeTint="A6"/>
+          <w:sz w:val="22"/>
+        </w:rPr>
+        <w:t>了公司的通用协议规范。</w:t>
+      </w:r>
     </w:p>
     <w:p>
       <w:pPr>
@@ -7061,15 +7016,8 @@
           <w:sz w:val="30"/>
           <w:szCs w:val="30"/>
         </w:rPr>
-        <w:t>至今</w:t>
-      </w:r>
-    </w:p>
-    <w:p>
-      <w:pPr>
-        <w:rPr>
-          <w:rFonts w:hint="eastAsia"/>
-        </w:rPr>
-      </w:pPr>
+        <w:t>2025.10</w:t>
+      </w:r>
     </w:p>
     <w:p>
       <w:pPr>
@@ -7664,20 +7612,148 @@
           <w:color w:val="595959" w:themeColor="text1" w:themeTint="A6"/>
           <w:sz w:val="22"/>
         </w:rPr>
-        <w:t>低功耗设备的测试与优化</w:t>
-      </w:r>
-    </w:p>
-    <w:p>
-      <w:pPr>
-        <w:snapToGrid w:val="0"/>
-        <w:spacing w:line="360" w:lineRule="exact"/>
-        <w:jc w:val="left"/>
-        <w:rPr>
-          <w:rFonts w:ascii="微软雅黑" w:eastAsia="微软雅黑" w:hAnsi="微软雅黑" w:hint="eastAsia"/>
-          <w:color w:val="595959" w:themeColor="text1" w:themeTint="A6"/>
-          <w:sz w:val="22"/>
-        </w:rPr>
-      </w:pPr>
+        <w:t>一个</w:t>
+      </w:r>
+      <w:r>
+        <w:rPr>
+          <w:rFonts w:ascii="微软雅黑" w:eastAsia="微软雅黑" w:hAnsi="微软雅黑" w:hint="eastAsia"/>
+          <w:color w:val="595959" w:themeColor="text1" w:themeTint="A6"/>
+          <w:sz w:val="22"/>
+        </w:rPr>
+        <w:t>在</w:t>
+      </w:r>
+      <w:proofErr w:type="spellStart"/>
+      <w:r>
+        <w:rPr>
+          <w:rFonts w:ascii="微软雅黑" w:eastAsia="微软雅黑" w:hAnsi="微软雅黑" w:hint="eastAsia"/>
+          <w:color w:val="595959" w:themeColor="text1" w:themeTint="A6"/>
+          <w:sz w:val="22"/>
+        </w:rPr>
+        <w:t>linux</w:t>
+      </w:r>
+      <w:proofErr w:type="spellEnd"/>
+      <w:r>
+        <w:rPr>
+          <w:rFonts w:ascii="微软雅黑" w:eastAsia="微软雅黑" w:hAnsi="微软雅黑" w:hint="eastAsia"/>
+          <w:color w:val="595959" w:themeColor="text1" w:themeTint="A6"/>
+          <w:sz w:val="22"/>
+        </w:rPr>
+        <w:t>平台下</w:t>
+      </w:r>
+      <w:r>
+        <w:rPr>
+          <w:rFonts w:ascii="微软雅黑" w:eastAsia="微软雅黑" w:hAnsi="微软雅黑" w:hint="eastAsia"/>
+          <w:color w:val="595959" w:themeColor="text1" w:themeTint="A6"/>
+          <w:sz w:val="22"/>
+        </w:rPr>
+        <w:t xml:space="preserve">使用C语言编写的 </w:t>
+      </w:r>
+      <w:r>
+        <w:rPr>
+          <w:rFonts w:ascii="微软雅黑" w:eastAsia="微软雅黑" w:hAnsi="微软雅黑" w:hint="eastAsia"/>
+          <w:color w:val="595959" w:themeColor="text1" w:themeTint="A6"/>
+          <w:sz w:val="22"/>
+        </w:rPr>
+        <w:t>ai</w:t>
+      </w:r>
+      <w:r>
+        <w:rPr>
+          <w:rFonts w:ascii="微软雅黑" w:eastAsia="微软雅黑" w:hAnsi="微软雅黑" w:hint="eastAsia"/>
+          <w:color w:val="595959" w:themeColor="text1" w:themeTint="A6"/>
+          <w:sz w:val="22"/>
+        </w:rPr>
+        <w:t>应用，</w:t>
+      </w:r>
+      <w:r>
+        <w:rPr>
+          <w:rFonts w:ascii="微软雅黑" w:eastAsia="微软雅黑" w:hAnsi="微软雅黑" w:hint="eastAsia"/>
+          <w:color w:val="595959" w:themeColor="text1" w:themeTint="A6"/>
+          <w:sz w:val="22"/>
+        </w:rPr>
+        <w:t>通过调用</w:t>
+      </w:r>
+      <w:r>
+        <w:rPr>
+          <w:rFonts w:ascii="微软雅黑" w:eastAsia="微软雅黑" w:hAnsi="微软雅黑" w:hint="eastAsia"/>
+          <w:color w:val="595959" w:themeColor="text1" w:themeTint="A6"/>
+          <w:sz w:val="22"/>
+        </w:rPr>
+        <w:t xml:space="preserve">AI </w:t>
+      </w:r>
+      <w:proofErr w:type="spellStart"/>
+      <w:r>
+        <w:rPr>
+          <w:rFonts w:ascii="微软雅黑" w:eastAsia="微软雅黑" w:hAnsi="微软雅黑" w:hint="eastAsia"/>
+          <w:color w:val="595959" w:themeColor="text1" w:themeTint="A6"/>
+          <w:sz w:val="22"/>
+        </w:rPr>
+        <w:t>api</w:t>
+      </w:r>
+      <w:proofErr w:type="spellEnd"/>
+      <w:r>
+        <w:rPr>
+          <w:rFonts w:ascii="微软雅黑" w:eastAsia="微软雅黑" w:hAnsi="微软雅黑" w:hint="eastAsia"/>
+          <w:color w:val="595959" w:themeColor="text1" w:themeTint="A6"/>
+          <w:sz w:val="22"/>
+        </w:rPr>
+        <w:t xml:space="preserve"> </w:t>
+      </w:r>
+      <w:r>
+        <w:rPr>
+          <w:rFonts w:ascii="微软雅黑" w:eastAsia="微软雅黑" w:hAnsi="微软雅黑" w:hint="eastAsia"/>
+          <w:color w:val="595959" w:themeColor="text1" w:themeTint="A6"/>
+          <w:sz w:val="22"/>
+        </w:rPr>
+        <w:t>实现自然语言</w:t>
+      </w:r>
+      <w:r>
+        <w:rPr>
+          <w:rFonts w:ascii="微软雅黑" w:eastAsia="微软雅黑" w:hAnsi="微软雅黑" w:hint="eastAsia"/>
+          <w:color w:val="595959" w:themeColor="text1" w:themeTint="A6"/>
+          <w:sz w:val="22"/>
+        </w:rPr>
+        <w:t>交互</w:t>
+      </w:r>
+      <w:r>
+        <w:rPr>
+          <w:rFonts w:ascii="微软雅黑" w:eastAsia="微软雅黑" w:hAnsi="微软雅黑" w:hint="eastAsia"/>
+          <w:color w:val="595959" w:themeColor="text1" w:themeTint="A6"/>
+          <w:sz w:val="22"/>
+        </w:rPr>
+        <w:t xml:space="preserve"> </w:t>
+      </w:r>
+      <w:r>
+        <w:rPr>
+          <w:rFonts w:ascii="微软雅黑" w:eastAsia="微软雅黑" w:hAnsi="微软雅黑" w:hint="eastAsia"/>
+          <w:color w:val="595959" w:themeColor="text1" w:themeTint="A6"/>
+          <w:sz w:val="22"/>
+        </w:rPr>
+        <w:t>式</w:t>
+      </w:r>
+      <w:r>
+        <w:rPr>
+          <w:rFonts w:ascii="微软雅黑" w:eastAsia="微软雅黑" w:hAnsi="微软雅黑" w:hint="eastAsia"/>
+          <w:color w:val="595959" w:themeColor="text1" w:themeTint="A6"/>
+          <w:sz w:val="22"/>
+        </w:rPr>
+        <w:t>的命令行ai</w:t>
+      </w:r>
+      <w:r>
+        <w:rPr>
+          <w:rFonts w:ascii="微软雅黑" w:eastAsia="微软雅黑" w:hAnsi="微软雅黑" w:hint="eastAsia"/>
+          <w:color w:val="595959" w:themeColor="text1" w:themeTint="A6"/>
+          <w:sz w:val="22"/>
+        </w:rPr>
+        <w:t>助手</w:t>
+      </w:r>
+      <w:r>
+        <w:rPr>
+          <w:rFonts w:ascii="微软雅黑" w:eastAsia="微软雅黑" w:hAnsi="微软雅黑" w:hint="eastAsia"/>
+          <w:color w:val="595959" w:themeColor="text1" w:themeTint="A6"/>
+          <w:sz w:val="22"/>
+        </w:rPr>
+        <w:t>。</w:t>
+      </w:r>
     </w:p>
     <w:p>
       <w:pPr>
@@ -7697,10 +7773,8 @@
     <w:p>
       <w:pPr>
         <w:pStyle w:val="1"/>
-        <w:spacing w:line="240" w:lineRule="atLeast"/>
-        <w:jc w:val="left"/>
-        <w:textAlignment w:val="top"/>
-        <w:rPr>
+        <w:rPr>
+          <w:rFonts w:hint="eastAsia"/>
           <w:color w:val="FFFFFF" w:themeColor="background1"/>
         </w:rPr>
       </w:pPr>
@@ -7712,18 +7786,18 @@
         <mc:AlternateContent>
           <mc:Choice Requires="wps">
             <w:drawing>
-              <wp:anchor distT="0" distB="0" distL="114300" distR="114300" simplePos="0" relativeHeight="251754496" behindDoc="0" locked="0" layoutInCell="1" allowOverlap="1" wp14:anchorId="5A3AB0DC" wp14:editId="76175AF8">
+              <wp:anchor distT="0" distB="0" distL="114300" distR="114300" simplePos="0" relativeHeight="251771904" behindDoc="0" locked="0" layoutInCell="1" allowOverlap="1" wp14:anchorId="705D470B" wp14:editId="457B71B9">
                 <wp:simplePos x="0" y="0"/>
                 <wp:positionH relativeFrom="column">
-                  <wp:posOffset>141408</wp:posOffset>
+                  <wp:posOffset>142122</wp:posOffset>
                 </wp:positionH>
                 <wp:positionV relativeFrom="paragraph">
-                  <wp:posOffset>147320</wp:posOffset>
+                  <wp:posOffset>129540</wp:posOffset>
                 </wp:positionV>
                 <wp:extent cx="194310" cy="150495"/>
                 <wp:effectExtent l="0" t="0" r="0" b="0"/>
                 <wp:wrapNone/>
-                <wp:docPr id="1776880792" name="文件夹"/>
+                <wp:docPr id="2070586477" name="文件夹"/>
                 <wp:cNvGraphicFramePr/>
                 <a:graphic xmlns:a="http://schemas.openxmlformats.org/drawingml/2006/main">
                   <a:graphicData uri="http://schemas.microsoft.com/office/word/2010/wordprocessingShape">
@@ -7882,7 +7956,7 @@
           </mc:Choice>
           <mc:Fallback>
             <w:pict>
-              <v:shape w14:anchorId="09E0E483" id="文件夹" o:spid="_x0000_s1026" style="position:absolute;margin-left:11.15pt;margin-top:11.6pt;width:15.3pt;height:11.85pt;flip:x;z-index:251754496;visibility:visible;mso-wrap-style:square;mso-wrap-distance-left:9pt;mso-wrap-distance-top:0;mso-wrap-distance-right:9pt;mso-wrap-distance-bottom:0;mso-position-horizontal:absolute;mso-position-horizontal-relative:text;mso-position-vertical:absolute;mso-position-vertical-relative:text;v-text-anchor:middle" coordsize="7782622,5514836" o:gfxdata="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" path="m7782622,1956116r-6662404,l4,5514836r6662404,l7782622,1956116xm2210075,l,,,1356040r2,l2,4425111,872566,1653131r5833379,l6705945,984566r-4094709,l2210075,xe" fillcolor="window" stroked="f" strokeweight="1pt">
+              <v:shape w14:anchorId="231519EC" id="文件夹" o:spid="_x0000_s1026" style="position:absolute;margin-left:11.2pt;margin-top:10.2pt;width:15.3pt;height:11.85pt;flip:x;z-index:251771904;visibility:visible;mso-wrap-style:square;mso-wrap-distance-left:9pt;mso-wrap-distance-top:0;mso-wrap-distance-right:9pt;mso-wrap-distance-bottom:0;mso-position-horizontal:absolute;mso-position-horizontal-relative:text;mso-position-vertical:absolute;mso-position-vertical-relative:text;v-text-anchor:middle" coordsize="7782622,5514836" o:gfxdata="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" path="m7782622,1956116r-6662404,l4,5514836r6662404,l7782622,1956116xm2210075,l,,,1356040r2,l2,4425111,872566,1653131r5833379,l6705945,984566r-4094709,l2210075,xe" fillcolor="window" stroked="f" strokeweight="1pt">
                 <v:stroke joinstyle="miter"/>
                 <v:path arrowok="t" o:connecttype="custom" o:connectlocs="194310,53381;27969,53381;0,150495;166341,150495;55179,0;0,0;0,37005;0,37005;0,120757;21785,45112;167428,45112;167428,26868;65195,26868" o:connectangles="0,0,0,0,0,0,0,0,0,0,0,0,0"/>
               </v:shape>
@@ -7897,18 +7971,18 @@
         <mc:AlternateContent>
           <mc:Choice Requires="wps">
             <w:drawing>
-              <wp:anchor distT="0" distB="0" distL="114300" distR="114300" simplePos="0" relativeHeight="251752448" behindDoc="0" locked="0" layoutInCell="1" allowOverlap="1" wp14:anchorId="56102919" wp14:editId="156CAC5F">
+              <wp:anchor distT="0" distB="0" distL="114300" distR="114300" simplePos="0" relativeHeight="251769856" behindDoc="0" locked="0" layoutInCell="1" allowOverlap="1" wp14:anchorId="2BC6A272" wp14:editId="7E52B9E4">
                 <wp:simplePos x="0" y="0"/>
                 <wp:positionH relativeFrom="column">
-                  <wp:posOffset>27129</wp:posOffset>
+                  <wp:posOffset>46863</wp:posOffset>
                 </wp:positionH>
                 <wp:positionV relativeFrom="paragraph">
-                  <wp:posOffset>76200</wp:posOffset>
+                  <wp:posOffset>62230</wp:posOffset>
                 </wp:positionV>
-                <wp:extent cx="1980025" cy="297815"/>
-                <wp:effectExtent l="38100" t="38100" r="115570" b="121285"/>
+                <wp:extent cx="1991995" cy="297815"/>
+                <wp:effectExtent l="38100" t="38100" r="122555" b="121285"/>
                 <wp:wrapNone/>
-                <wp:docPr id="1645101169" name="流程图: 手动输入 2"/>
+                <wp:docPr id="398086901" name="流程图: 手动输入 2"/>
                 <wp:cNvGraphicFramePr/>
                 <a:graphic xmlns:a="http://schemas.openxmlformats.org/drawingml/2006/main">
                   <a:graphicData uri="http://schemas.microsoft.com/office/word/2010/wordprocessingShape">
@@ -7917,7 +7991,7 @@
                       <wps:spPr>
                         <a:xfrm flipH="1">
                           <a:off x="0" y="0"/>
-                          <a:ext cx="1980025" cy="297815"/>
+                          <a:ext cx="1991995" cy="297815"/>
                         </a:xfrm>
                         <a:prstGeom prst="rect">
                           <a:avLst/>
@@ -7951,9 +8025,6 @@
                     </wps:wsp>
                   </a:graphicData>
                 </a:graphic>
-                <wp14:sizeRelH relativeFrom="margin">
-                  <wp14:pctWidth>0</wp14:pctWidth>
-                </wp14:sizeRelH>
                 <wp14:sizeRelV relativeFrom="margin">
                   <wp14:pctHeight>0</wp14:pctHeight>
                 </wp14:sizeRelV>
@@ -7962,7 +8033,7 @@
           </mc:Choice>
           <mc:Fallback>
             <w:pict>
-              <v:rect w14:anchorId="56102919" id="_x0000_s1074" style="position:absolute;margin-left:2.15pt;margin-top:6pt;width:155.9pt;height:23.45pt;flip:x;z-index:251752448;visibility:visible;mso-wrap-style:square;mso-width-percent:0;mso-height-percent:0;mso-wrap-distance-left:9pt;mso-wrap-distance-top:0;mso-wrap-distance-right:9pt;mso-wrap-distance-bottom:0;mso-position-horizontal:absolute;mso-position-horizontal-relative:text;mso-position-vertical:absolute;mso-position-vertical-relative:text;mso-width-percent:0;mso-height-percent:0;mso-width-relative:margin;mso-height-relative:margin;v-text-anchor:middle" o:gfxdata="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" fillcolor="#5290bf" strokecolor="#5290bf" strokeweight="1pt">
+              <v:rect w14:anchorId="2BC6A272" id="_x0000_s1074" style="position:absolute;left:0;text-align:left;margin-left:3.7pt;margin-top:4.9pt;width:156.85pt;height:23.45pt;flip:x;z-index:251769856;visibility:visible;mso-wrap-style:square;mso-height-percent:0;mso-wrap-distance-left:9pt;mso-wrap-distance-top:0;mso-wrap-distance-right:9pt;mso-wrap-distance-bottom:0;mso-position-horizontal:absolute;mso-position-horizontal-relative:text;mso-position-vertical:absolute;mso-position-vertical-relative:text;mso-height-percent:0;mso-height-relative:margin;v-text-anchor:middle" o:gfxdata="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" fillcolor="#5290bf" strokecolor="#5290bf" strokeweight="1pt">
                 <v:shadow on="t" color="black" opacity="26214f" origin="-.5,-.5" offset=".74836mm,.74836mm"/>
                 <v:textbox>
                   <w:txbxContent>
@@ -7981,18 +8052,18 @@
         <mc:AlternateContent>
           <mc:Choice Requires="wps">
             <w:drawing>
-              <wp:anchor distT="0" distB="0" distL="114300" distR="114300" simplePos="0" relativeHeight="251753472" behindDoc="0" locked="0" layoutInCell="1" allowOverlap="1" wp14:anchorId="01601A05" wp14:editId="69105C53">
+              <wp:anchor distT="0" distB="0" distL="114300" distR="114300" simplePos="0" relativeHeight="251770880" behindDoc="0" locked="0" layoutInCell="1" allowOverlap="1" wp14:anchorId="46B24ECC" wp14:editId="4185C266">
                 <wp:simplePos x="0" y="0"/>
                 <wp:positionH relativeFrom="column">
-                  <wp:posOffset>334430</wp:posOffset>
+                  <wp:posOffset>359242</wp:posOffset>
                 </wp:positionH>
                 <wp:positionV relativeFrom="paragraph">
-                  <wp:posOffset>82458</wp:posOffset>
+                  <wp:posOffset>85725</wp:posOffset>
                 </wp:positionV>
-                <wp:extent cx="1671701" cy="305682"/>
-                <wp:effectExtent l="0" t="0" r="0" b="0"/>
+                <wp:extent cx="1233170" cy="259819"/>
+                <wp:effectExtent l="0" t="0" r="0" b="6985"/>
                 <wp:wrapNone/>
-                <wp:docPr id="616272406" name="文本框 1"/>
+                <wp:docPr id="2060871996" name="文本框 1"/>
                 <wp:cNvGraphicFramePr/>
                 <a:graphic xmlns:a="http://schemas.openxmlformats.org/drawingml/2006/main">
                   <a:graphicData uri="http://schemas.microsoft.com/office/word/2010/wordprocessingShape">
@@ -8001,7 +8072,7 @@
                       <wps:spPr>
                         <a:xfrm>
                           <a:off x="0" y="0"/>
-                          <a:ext cx="1671701" cy="305682"/>
+                          <a:ext cx="1233170" cy="259819"/>
                         </a:xfrm>
                         <a:prstGeom prst="rect">
                           <a:avLst/>
@@ -8016,7 +8087,9 @@
                         <w:txbxContent>
                           <w:p>
                             <w:pPr>
+                              <w:jc w:val="left"/>
                               <w:rPr>
+                                <w:rFonts w:ascii="微软雅黑" w:eastAsia="微软雅黑" w:hAnsi="微软雅黑" w:hint="eastAsia"/>
                                 <w:color w:val="FFFFFF" w:themeColor="background1"/>
                                 <w:sz w:val="24"/>
                                 <w:szCs w:val="24"/>
@@ -8029,7 +8102,7 @@
                                 <w:sz w:val="24"/>
                                 <w:szCs w:val="24"/>
                               </w:rPr>
-                              <w:t>典型案例的详细介绍</w:t>
+                              <w:t>附件</w:t>
                             </w:r>
                           </w:p>
                           <w:p>
@@ -8051,9 +8124,6 @@
                     </wps:wsp>
                   </a:graphicData>
                 </a:graphic>
-                <wp14:sizeRelH relativeFrom="margin">
-                  <wp14:pctWidth>0</wp14:pctWidth>
-                </wp14:sizeRelH>
                 <wp14:sizeRelV relativeFrom="margin">
                   <wp14:pctHeight>0</wp14:pctHeight>
                 </wp14:sizeRelV>
@@ -8062,12 +8132,14 @@
           </mc:Choice>
           <mc:Fallback>
             <w:pict>
-              <v:shape w14:anchorId="01601A05" id="_x0000_s1075" type="#_x0000_t202" style="position:absolute;margin-left:26.35pt;margin-top:6.5pt;width:131.65pt;height:24.05pt;z-index:251753472;visibility:visible;mso-wrap-style:square;mso-width-percent:0;mso-height-percent:0;mso-wrap-distance-left:9pt;mso-wrap-distance-top:0;mso-wrap-distance-right:9pt;mso-wrap-distance-bottom:0;mso-position-horizontal:absolute;mso-position-horizontal-relative:text;mso-position-vertical:absolute;mso-position-vertical-relative:text;mso-width-percent:0;mso-height-percent:0;mso-width-relative:margin;mso-height-relative:margin;v-text-anchor:top" o:gfxdata="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" filled="f" stroked="f" strokeweight=".5pt">
+              <v:shape w14:anchorId="46B24ECC" id="_x0000_s1075" type="#_x0000_t202" style="position:absolute;left:0;text-align:left;margin-left:28.3pt;margin-top:6.75pt;width:97.1pt;height:20.45pt;z-index:251770880;visibility:visible;mso-wrap-style:square;mso-height-percent:0;mso-wrap-distance-left:9pt;mso-wrap-distance-top:0;mso-wrap-distance-right:9pt;mso-wrap-distance-bottom:0;mso-position-horizontal:absolute;mso-position-horizontal-relative:text;mso-position-vertical:absolute;mso-position-vertical-relative:text;mso-height-percent:0;mso-height-relative:margin;v-text-anchor:top" o:gfxdata="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" filled="f" stroked="f" strokeweight=".5pt">
                 <v:textbox>
                   <w:txbxContent>
                     <w:p>
                       <w:pPr>
+                        <w:jc w:val="left"/>
                         <w:rPr>
+                          <w:rFonts w:ascii="微软雅黑" w:eastAsia="微软雅黑" w:hAnsi="微软雅黑" w:hint="eastAsia"/>
                           <w:color w:val="FFFFFF" w:themeColor="background1"/>
                           <w:sz w:val="24"/>
                           <w:szCs w:val="24"/>
@@ -8080,7 +8152,7 @@
                           <w:sz w:val="24"/>
                           <w:szCs w:val="24"/>
                         </w:rPr>
-                        <w:t>典型案例的详细介绍</w:t>
+                        <w:t>附件</w:t>
                       </w:r>
                     </w:p>
                     <w:p>
@@ -8102,12 +8174,255 @@
         </mc:AlternateContent>
       </w:r>
       <w:r>
+        <w:tab/>
+      </w:r>
+      <w:r>
         <w:rPr>
           <w:rFonts w:hint="eastAsia"/>
           <w:color w:val="FFFFFF" w:themeColor="background1"/>
         </w:rPr>
-        <w:t>典型案例的详细介绍</w:t>
-      </w:r>
+        <w:t>工作案例</w:t>
+      </w:r>
+    </w:p>
+    <w:p>
+      <w:pPr>
+        <w:jc w:val="left"/>
+        <w:rPr>
+          <w:color w:val="FFFFFF" w:themeColor="background1"/>
+        </w:rPr>
+      </w:pPr>
+      <w:r>
+        <w:rPr>
+          <w:rFonts w:hint="eastAsia"/>
+          <w:color w:val="FFFFFF" w:themeColor="background1"/>
+        </w:rPr>
+        <w:t>附件</w:t>
+      </w:r>
+      <w:r>
+        <w:rPr>
+          <w:noProof/>
+        </w:rPr>
+        <w:drawing>
+          <wp:inline distT="0" distB="0" distL="0" distR="0" wp14:anchorId="59059619" wp14:editId="04878F1B">
+            <wp:extent cx="3885022" cy="1986731"/>
+            <wp:effectExtent l="19050" t="19050" r="20320" b="13970"/>
+            <wp:docPr id="1682264854" name="图片 1"/>
+            <wp:cNvGraphicFramePr>
+              <a:graphicFrameLocks xmlns:a="http://schemas.openxmlformats.org/drawingml/2006/main" noChangeAspect="1"/>
+            </wp:cNvGraphicFramePr>
+            <a:graphic xmlns:a="http://schemas.openxmlformats.org/drawingml/2006/main">
+              <a:graphicData uri="http://schemas.openxmlformats.org/drawingml/2006/picture">
+                <pic:pic xmlns:pic="http://schemas.openxmlformats.org/drawingml/2006/picture">
+                  <pic:nvPicPr>
+                    <pic:cNvPr id="677159134" name=""/>
+                    <pic:cNvPicPr/>
+                  </pic:nvPicPr>
+                  <pic:blipFill>
+                    <a:blip r:embed="rId10"/>
+                    <a:stretch>
+                      <a:fillRect/>
+                    </a:stretch>
+                  </pic:blipFill>
+                  <pic:spPr>
+                    <a:xfrm>
+                      <a:off x="0" y="0"/>
+                      <a:ext cx="3900047" cy="1994415"/>
+                    </a:xfrm>
+                    <a:prstGeom prst="rect">
+                      <a:avLst/>
+                    </a:prstGeom>
+                    <a:ln>
+                      <a:solidFill>
+                        <a:schemeClr val="tx1"/>
+                      </a:solidFill>
+                    </a:ln>
+                  </pic:spPr>
+                </pic:pic>
+              </a:graphicData>
+            </a:graphic>
+          </wp:inline>
+        </w:drawing>
+      </w:r>
+      <w:r>
+        <w:rPr>
+          <w:noProof/>
+        </w:rPr>
+        <w:drawing>
+          <wp:inline distT="0" distB="0" distL="0" distR="0" wp14:anchorId="0A1C875F" wp14:editId="0381F05A">
+            <wp:extent cx="1549500" cy="1807318"/>
+            <wp:effectExtent l="133350" t="114300" r="127000" b="173990"/>
+            <wp:docPr id="1220974150" name="图片 41"/>
+            <wp:cNvGraphicFramePr>
+              <a:graphicFrameLocks xmlns:a="http://schemas.openxmlformats.org/drawingml/2006/main" noChangeAspect="1"/>
+            </wp:cNvGraphicFramePr>
+            <a:graphic xmlns:a="http://schemas.openxmlformats.org/drawingml/2006/main">
+              <a:graphicData uri="http://schemas.openxmlformats.org/drawingml/2006/picture">
+                <pic:pic xmlns:pic="http://schemas.openxmlformats.org/drawingml/2006/picture">
+                  <pic:nvPicPr>
+                    <pic:cNvPr id="0" name="Picture 1"/>
+                    <pic:cNvPicPr>
+                      <a:picLocks noChangeAspect="1" noChangeArrowheads="1"/>
+                    </pic:cNvPicPr>
+                  </pic:nvPicPr>
+                  <pic:blipFill rotWithShape="1">
+                    <a:blip r:embed="rId11" cstate="print">
+                      <a:extLst>
+                        <a:ext uri="{28A0092B-C50C-407E-A947-70E740481C1C}">
+                          <a14:useLocalDpi xmlns:a14="http://schemas.microsoft.com/office/drawing/2010/main" val="0"/>
+                        </a:ext>
+                      </a:extLst>
+                    </a:blip>
+                    <a:srcRect b="38057"/>
+                    <a:stretch>
+                      <a:fillRect/>
+                    </a:stretch>
+                  </pic:blipFill>
+                  <pic:spPr bwMode="auto">
+                    <a:xfrm>
+                      <a:off x="0" y="0"/>
+                      <a:ext cx="1597900" cy="1863771"/>
+                    </a:xfrm>
+                    <a:prstGeom prst="rect">
+                      <a:avLst/>
+                    </a:prstGeom>
+                    <a:solidFill>
+                      <a:srgbClr val="FFFFFF">
+                        <a:shade val="85000"/>
+                      </a:srgbClr>
+                    </a:solidFill>
+                    <a:ln w="88900" cap="sq" cmpd="sng" algn="ctr">
+                      <a:solidFill>
+                        <a:srgbClr val="FFFFFF"/>
+                      </a:solidFill>
+                      <a:prstDash val="solid"/>
+                      <a:miter lim="800000"/>
+                      <a:headEnd type="none" w="med" len="med"/>
+                      <a:tailEnd type="none" w="med" len="med"/>
+                      <a:extLst>
+                        <a:ext uri="{C807C97D-BFC1-408E-A445-0C87EB9F89A2}">
+                          <ask:lineSketchStyleProps xmlns:ask="http://schemas.microsoft.com/office/drawing/2018/sketchyshapes" sd="0">
+                            <a:custGeom>
+                              <a:avLst/>
+                              <a:gdLst/>
+                              <a:ahLst/>
+                              <a:cxnLst/>
+                              <a:rect l="0" t="0" r="0" b="0"/>
+                              <a:pathLst/>
+                            </a:custGeom>
+                            <ask:type/>
+                          </ask:lineSketchStyleProps>
+                        </a:ext>
+                      </a:extLst>
+                    </a:ln>
+                    <a:effectLst>
+                      <a:outerShdw blurRad="55000" dist="18000" dir="5400000" algn="tl" rotWithShape="0">
+                        <a:srgbClr val="000000">
+                          <a:alpha val="40000"/>
+                        </a:srgbClr>
+                      </a:outerShdw>
+                    </a:effectLst>
+                    <a:scene3d>
+                      <a:camera prst="orthographicFront"/>
+                      <a:lightRig rig="twoPt" dir="t">
+                        <a:rot lat="0" lon="0" rev="7200000"/>
+                      </a:lightRig>
+                    </a:scene3d>
+                    <a:sp3d>
+                      <a:bevelT w="25400" h="19050"/>
+                      <a:contourClr>
+                        <a:srgbClr val="FFFFFF"/>
+                      </a:contourClr>
+                    </a:sp3d>
+                    <a:extLst>
+                      <a:ext uri="{53640926-AAD7-44D8-BBD7-CCE9431645EC}">
+                        <a14:shadowObscured xmlns:a14="http://schemas.microsoft.com/office/drawing/2010/main"/>
+                      </a:ext>
+                    </a:extLst>
+                  </pic:spPr>
+                </pic:pic>
+              </a:graphicData>
+            </a:graphic>
+          </wp:inline>
+        </w:drawing>
+      </w:r>
+    </w:p>
+    <w:p>
+      <w:pPr>
+        <w:rPr>
+          <w:rFonts w:hint="eastAsia"/>
+          <w:color w:val="FFFFFF" w:themeColor="background1"/>
+        </w:rPr>
+      </w:pPr>
+    </w:p>
+    <w:p>
+      <w:pPr>
+        <w:rPr>
+          <w:color w:val="FFFFFF" w:themeColor="background1"/>
+        </w:rPr>
+      </w:pPr>
+      <w:r>
+        <w:rPr>
+          <w:noProof/>
+        </w:rPr>
+        <w:drawing>
+          <wp:inline distT="0" distB="0" distL="0" distR="0" wp14:anchorId="39582A54" wp14:editId="2A66D14D">
+            <wp:extent cx="4859594" cy="2472421"/>
+            <wp:effectExtent l="0" t="0" r="0" b="4445"/>
+            <wp:docPr id="1340634898" name="图片 1"/>
+            <wp:cNvGraphicFramePr>
+              <a:graphicFrameLocks xmlns:a="http://schemas.openxmlformats.org/drawingml/2006/main" noChangeAspect="1"/>
+            </wp:cNvGraphicFramePr>
+            <a:graphic xmlns:a="http://schemas.openxmlformats.org/drawingml/2006/main">
+              <a:graphicData uri="http://schemas.openxmlformats.org/drawingml/2006/picture">
+                <pic:pic xmlns:pic="http://schemas.openxmlformats.org/drawingml/2006/picture">
+                  <pic:nvPicPr>
+                    <pic:cNvPr id="1340634898" name=""/>
+                    <pic:cNvPicPr/>
+                  </pic:nvPicPr>
+                  <pic:blipFill rotWithShape="1">
+                    <a:blip r:embed="rId12" cstate="print">
+                      <a:extLst>
+                        <a:ext uri="{28A0092B-C50C-407E-A947-70E740481C1C}">
+                          <a14:useLocalDpi xmlns:a14="http://schemas.microsoft.com/office/drawing/2010/main" val="0"/>
+                        </a:ext>
+                      </a:extLst>
+                    </a:blip>
+                    <a:srcRect l="11299" t="12448" r="17524" b="17482"/>
+                    <a:stretch>
+                      <a:fillRect/>
+                    </a:stretch>
+                  </pic:blipFill>
+                  <pic:spPr bwMode="auto">
+                    <a:xfrm>
+                      <a:off x="0" y="0"/>
+                      <a:ext cx="4917009" cy="2501632"/>
+                    </a:xfrm>
+                    <a:prstGeom prst="rect">
+                      <a:avLst/>
+                    </a:prstGeom>
+                    <a:ln>
+                      <a:noFill/>
+                    </a:ln>
+                    <a:extLst>
+                      <a:ext uri="{53640926-AAD7-44D8-BBD7-CCE9431645EC}">
+                        <a14:shadowObscured xmlns:a14="http://schemas.microsoft.com/office/drawing/2010/main"/>
+                      </a:ext>
+                    </a:extLst>
+                  </pic:spPr>
+                </pic:pic>
+              </a:graphicData>
+            </a:graphic>
+          </wp:inline>
+        </w:drawing>
+      </w:r>
+    </w:p>
+    <w:p>
+      <w:pPr>
+        <w:rPr>
+          <w:rFonts w:hint="eastAsia"/>
+          <w:color w:val="FFFFFF" w:themeColor="background1"/>
+        </w:rPr>
+      </w:pPr>
     </w:p>
     <w:p>
       <w:pPr>
@@ -8123,7 +8438,7 @@
           <w:sz w:val="30"/>
           <w:szCs w:val="30"/>
         </w:rPr>
-        <w:t>OTA</w:t>
+        <w:t>二级</w:t>
       </w:r>
       <w:r>
         <w:rPr>
@@ -8131,449 +8446,79 @@
           <w:sz w:val="30"/>
           <w:szCs w:val="30"/>
         </w:rPr>
-        <w:t>升级</w:t>
+        <w:t>office</w:t>
+      </w:r>
+      <w:r>
+        <w:rPr>
+          <w:rFonts w:hint="eastAsia"/>
+          <w:sz w:val="30"/>
+          <w:szCs w:val="30"/>
+        </w:rPr>
+        <w:t>证书：</w:t>
       </w:r>
     </w:p>
     <w:p>
       <w:pPr>
-        <w:jc w:val="left"/>
+        <w:ind w:leftChars="270" w:left="567"/>
+        <w:rPr>
+          <w:noProof/>
+        </w:rPr>
       </w:pPr>
       <w:r>
-        <w:tab/>
-      </w:r>
-      <w:r>
-        <w:rPr>
-          <w:rFonts w:hint="eastAsia"/>
-        </w:rPr>
-        <w:t>远程升级在多个项目都有涉及，底层代码或升级机制都是一致的，只是传输协议不一样而已。详细升级流程如下：</w:t>
-      </w:r>
-    </w:p>
-    <w:p>
-      <w:pPr>
-        <w:pStyle w:val="aa"/>
-        <w:numPr>
-          <w:ilvl w:val="0"/>
-          <w:numId w:val="5"/>
-        </w:numPr>
-        <w:ind w:left="426" w:firstLineChars="0"/>
-        <w:jc w:val="left"/>
-      </w:pPr>
-      <w:r>
-        <w:rPr>
-          <w:rFonts w:hint="eastAsia"/>
-        </w:rPr>
-        <w:t>设备上线等待服务器指令，服务器监控到设备已上线，立即下发升级起始指令：</w:t>
-      </w:r>
-      <w:r>
-        <w:t>{"PackLen":128}</w:t>
-      </w:r>
-    </w:p>
-    <w:p>
-      <w:pPr>
-        <w:pStyle w:val="aa"/>
-        <w:numPr>
-          <w:ilvl w:val="0"/>
-          <w:numId w:val="5"/>
-        </w:numPr>
-        <w:ind w:left="426" w:firstLineChars="0"/>
-        <w:jc w:val="left"/>
-      </w:pPr>
-      <w:r>
-        <w:rPr>
-          <w:rFonts w:hint="eastAsia"/>
-        </w:rPr>
-        <w:t>设备接收到升级开始的指令，回复</w:t>
-      </w:r>
-      <w:r>
-        <w:rPr>
-          <w:rFonts w:hint="eastAsia"/>
-        </w:rPr>
-        <w:t>：</w:t>
-      </w:r>
-      <w:r>
-        <w:rPr>
-          <w:rFonts w:hint="eastAsia"/>
-        </w:rPr>
-        <w:t>{</w:t>
-      </w:r>
-      <w:r>
-        <w:t>"upgrades</w:t>
-      </w:r>
-      <w:r>
-        <w:t>"</w:t>
-      </w:r>
-      <w:r>
-        <w:t>: "start"</w:t>
-      </w:r>
-      <w:r>
-        <w:rPr>
-          <w:rFonts w:hint="eastAsia"/>
-        </w:rPr>
-        <w:t>}</w:t>
-      </w:r>
-      <w:r>
-        <w:rPr>
-          <w:rFonts w:hint="eastAsia"/>
-        </w:rPr>
-        <w:t>，非实时在线的固定等待一段时间</w:t>
-      </w:r>
-    </w:p>
-    <w:p>
-      <w:pPr>
-        <w:pStyle w:val="aa"/>
-        <w:numPr>
-          <w:ilvl w:val="0"/>
-          <w:numId w:val="5"/>
-        </w:numPr>
-        <w:ind w:left="426" w:firstLineChars="0"/>
-        <w:jc w:val="left"/>
-      </w:pPr>
-      <w:r>
-        <w:rPr>
-          <w:rFonts w:hint="eastAsia"/>
-        </w:rPr>
-        <w:t>服务将收到</w:t>
-      </w:r>
-      <w:r>
-        <w:rPr>
-          <w:rFonts w:hint="eastAsia"/>
-        </w:rPr>
-        <w:t xml:space="preserve"> start </w:t>
-      </w:r>
-      <w:r>
-        <w:rPr>
-          <w:rFonts w:hint="eastAsia"/>
-        </w:rPr>
-        <w:t>信息后，将</w:t>
-      </w:r>
-      <w:r>
-        <w:rPr>
-          <w:rFonts w:hint="eastAsia"/>
-        </w:rPr>
-        <w:t>bin</w:t>
-      </w:r>
-      <w:r>
-        <w:rPr>
-          <w:rFonts w:hint="eastAsia"/>
-        </w:rPr>
-        <w:t>文件拆分成一个</w:t>
-      </w:r>
-      <w:r>
-        <w:rPr>
-          <w:rFonts w:hint="eastAsia"/>
-        </w:rPr>
-        <w:t xml:space="preserve"> &lt;List&gt; </w:t>
-      </w:r>
-      <w:r>
-        <w:rPr>
-          <w:rFonts w:hint="eastAsia"/>
-        </w:rPr>
-        <w:t>然后发送：</w:t>
-      </w:r>
-      <w:r>
-        <w:br/>
-      </w:r>
-      <w:r>
-        <w:rPr>
-          <w:rFonts w:hint="eastAsia"/>
-        </w:rPr>
-        <w:t>{</w:t>
-      </w:r>
-      <w:r>
-        <w:t>"NowPackNum":0,"Code":"11223344556677889900","CsCheckNum":114}</w:t>
-      </w:r>
-    </w:p>
-    <w:p>
-      <w:pPr>
-        <w:pStyle w:val="aa"/>
-        <w:numPr>
-          <w:ilvl w:val="0"/>
-          <w:numId w:val="5"/>
-        </w:numPr>
-        <w:ind w:left="426" w:firstLineChars="0"/>
-        <w:jc w:val="left"/>
-      </w:pPr>
-      <w:r>
-        <w:rPr>
-          <w:rFonts w:hint="eastAsia"/>
-        </w:rPr>
-        <w:t>设备收到后，缓存包序号和包长度，设备先依据校验数校验数据，若无误则根据长度和序号信息将</w:t>
-      </w:r>
-      <w:r>
-        <w:rPr>
-          <w:rFonts w:hint="eastAsia"/>
-        </w:rPr>
-        <w:t xml:space="preserve"> </w:t>
-      </w:r>
-      <w:r>
-        <w:t>Code</w:t>
-      </w:r>
-      <w:r>
-        <w:rPr>
-          <w:rFonts w:hint="eastAsia"/>
-        </w:rPr>
-        <w:t xml:space="preserve"> </w:t>
-      </w:r>
-      <w:r>
-        <w:rPr>
-          <w:rFonts w:hint="eastAsia"/>
-        </w:rPr>
-        <w:t>信息写入缓存区，等待凑满一页后再写入</w:t>
-      </w:r>
-      <w:r>
-        <w:rPr>
-          <w:rFonts w:hint="eastAsia"/>
-        </w:rPr>
-        <w:t>flash</w:t>
-      </w:r>
-      <w:r>
-        <w:rPr>
-          <w:rFonts w:hint="eastAsia"/>
-        </w:rPr>
-        <w:t>。同时设备回复服务器：</w:t>
-      </w:r>
-      <w:r>
-        <w:rPr>
-          <w:rFonts w:hint="eastAsia"/>
-        </w:rPr>
-        <w:t>{</w:t>
-      </w:r>
-      <w:r>
-        <w:t>"upgrades", "</w:t>
-      </w:r>
-      <w:r>
-        <w:rPr>
-          <w:rFonts w:hint="eastAsia"/>
-        </w:rPr>
-        <w:t>OK</w:t>
-      </w:r>
-      <w:r>
-        <w:t>"</w:t>
-      </w:r>
-      <w:r>
-        <w:rPr>
-          <w:rFonts w:hint="eastAsia"/>
-        </w:rPr>
-        <w:t>,</w:t>
-      </w:r>
-      <w:r>
-        <w:t>"NowPackNum:</w:t>
-      </w:r>
-      <w:r>
-        <w:rPr>
-          <w:rFonts w:hint="eastAsia"/>
-        </w:rPr>
-        <w:t>0}</w:t>
-      </w:r>
-    </w:p>
-    <w:p>
-      <w:pPr>
-        <w:pStyle w:val="aa"/>
-        <w:numPr>
-          <w:ilvl w:val="0"/>
-          <w:numId w:val="5"/>
-        </w:numPr>
-        <w:ind w:left="426" w:firstLineChars="0"/>
-        <w:jc w:val="left"/>
-      </w:pPr>
-      <w:r>
-        <w:rPr>
-          <w:rFonts w:hint="eastAsia"/>
-        </w:rPr>
-        <w:t>若升级中有某种原因导致设备没有回复，服务器判断某一包升级不成功，可最后补发或断点续传。</w:t>
-      </w:r>
-    </w:p>
-    <w:p>
-      <w:pPr>
-        <w:pStyle w:val="aa"/>
-        <w:numPr>
-          <w:ilvl w:val="0"/>
-          <w:numId w:val="5"/>
-        </w:numPr>
-        <w:ind w:left="426" w:firstLineChars="0"/>
-        <w:jc w:val="left"/>
-      </w:pPr>
-      <w:r>
-        <w:rPr>
-          <w:rFonts w:hint="eastAsia"/>
-        </w:rPr>
-        <w:t>服务器判断全部升级结束后，发送结束指令：</w:t>
-      </w:r>
-      <w:r>
-        <w:t>{"upDataFlag":true,"CsCheckNum":90,"pageNum":10}</w:t>
-      </w:r>
-      <w:r>
-        <w:rPr>
-          <w:rFonts w:hint="eastAsia"/>
-        </w:rPr>
-        <w:t>。包含校验信息和总页数，总页数由服务器更加升级固件和</w:t>
-      </w:r>
-      <w:r>
-        <w:rPr>
-          <w:rFonts w:hint="eastAsia"/>
-        </w:rPr>
-        <w:t xml:space="preserve">flash </w:t>
-      </w:r>
-      <w:proofErr w:type="gramStart"/>
-      <w:r>
-        <w:rPr>
-          <w:rFonts w:hint="eastAsia"/>
-        </w:rPr>
-        <w:t>页大小</w:t>
-      </w:r>
-      <w:proofErr w:type="gramEnd"/>
-      <w:r>
-        <w:rPr>
-          <w:rFonts w:hint="eastAsia"/>
-        </w:rPr>
-        <w:t>计算得来。</w:t>
-      </w:r>
-    </w:p>
-    <w:p>
-      <w:pPr>
-        <w:pStyle w:val="aa"/>
-        <w:numPr>
-          <w:ilvl w:val="0"/>
-          <w:numId w:val="5"/>
-        </w:numPr>
-        <w:ind w:left="426" w:firstLineChars="0"/>
-        <w:jc w:val="left"/>
-      </w:pPr>
-      <w:r>
-        <w:rPr>
-          <w:rFonts w:hint="eastAsia"/>
-        </w:rPr>
-        <w:t>升级结束后，设备重启，由</w:t>
-      </w:r>
-      <w:r>
-        <w:rPr>
-          <w:rFonts w:hint="eastAsia"/>
-        </w:rPr>
-        <w:t>bootloader</w:t>
-      </w:r>
-      <w:r>
-        <w:rPr>
-          <w:rFonts w:hint="eastAsia"/>
-        </w:rPr>
-        <w:t>将升级后的数据</w:t>
-      </w:r>
-      <w:r>
-        <w:rPr>
-          <w:rFonts w:hint="eastAsia"/>
-        </w:rPr>
-        <w:t>复制到运行区后跳转运行。</w:t>
-      </w:r>
-    </w:p>
-    <w:p/>
-    <w:p>
-      <w:r>
-        <w:tab/>
-      </w:r>
-      <w:r>
-        <w:rPr>
-          <w:rFonts w:hint="eastAsia"/>
-        </w:rPr>
-        <w:t>特别的，在升级的时候，不仅需要关注升级的交互流程与逻辑问题，升级的流畅性问题，以及升级的效率问题。</w:t>
-      </w:r>
-    </w:p>
-    <w:p>
-      <w:pPr>
-        <w:pStyle w:val="aa"/>
-        <w:numPr>
-          <w:ilvl w:val="0"/>
-          <w:numId w:val="6"/>
-        </w:numPr>
-        <w:ind w:firstLineChars="0"/>
-      </w:pPr>
-      <w:r>
-        <w:rPr>
-          <w:rFonts w:hint="eastAsia"/>
-        </w:rPr>
-        <w:t>设备如何高效的取出下行指令，这个与中断接收机制有关，可以用定时器定时</w:t>
-      </w:r>
-      <w:r>
-        <w:rPr>
-          <w:rFonts w:hint="eastAsia"/>
-        </w:rPr>
-        <w:t>30ms</w:t>
-      </w:r>
-      <w:r>
-        <w:rPr>
-          <w:rFonts w:hint="eastAsia"/>
-        </w:rPr>
-        <w:t>后定时取出，并清空缓存</w:t>
-      </w:r>
-      <w:r>
-        <w:rPr>
-          <w:rFonts w:hint="eastAsia"/>
-        </w:rPr>
-        <w:t>buf</w:t>
-      </w:r>
-      <w:r>
-        <w:rPr>
-          <w:rFonts w:hint="eastAsia"/>
-        </w:rPr>
-        <w:t>f</w:t>
-      </w:r>
-      <w:r>
-        <w:rPr>
-          <w:rFonts w:hint="eastAsia"/>
-        </w:rPr>
-        <w:t>，在通过标记或其他方式，使指令执行模块处理指令并回复。</w:t>
-      </w:r>
-    </w:p>
-    <w:p>
-      <w:pPr>
-        <w:pStyle w:val="aa"/>
-        <w:numPr>
-          <w:ilvl w:val="0"/>
-          <w:numId w:val="6"/>
-        </w:numPr>
-        <w:ind w:firstLineChars="0"/>
-      </w:pPr>
-      <w:r>
-        <w:rPr>
-          <w:rFonts w:hint="eastAsia"/>
-        </w:rPr>
-        <w:t>若因为某些原因导致设备回复慢，导致服务器发送多次指令，此时应该使用指令缓存队列，确保在执行指令时，尽量不要丢失指令。</w:t>
-      </w:r>
-    </w:p>
-    <w:p>
-      <w:pPr>
-        <w:pStyle w:val="aa"/>
-        <w:numPr>
-          <w:ilvl w:val="0"/>
-          <w:numId w:val="6"/>
-        </w:numPr>
-        <w:ind w:firstLineChars="0"/>
-      </w:pPr>
-      <w:r>
-        <w:rPr>
-          <w:rFonts w:hint="eastAsia"/>
-        </w:rPr>
-        <w:t>若服务器收到设备回复的两条指令，此时需要区分指令，避免响应两次，再次发送相同的两条指令，需要一个字段记录指令的流水号</w:t>
-      </w:r>
-      <w:r>
-        <w:rPr>
-          <w:rFonts w:hint="eastAsia"/>
-        </w:rPr>
-        <w:t>。设备完整返回流水号即可。</w:t>
-      </w:r>
-    </w:p>
-    <w:p>
-      <w:pPr>
-        <w:pStyle w:val="aa"/>
-        <w:numPr>
-          <w:ilvl w:val="0"/>
-          <w:numId w:val="6"/>
-        </w:numPr>
-        <w:ind w:firstLineChars="0"/>
-      </w:pPr>
-      <w:r>
-        <w:rPr>
-          <w:rFonts w:hint="eastAsia"/>
-        </w:rPr>
-        <w:t>设备多次不响应服务器时，服务器应当记录当前进度，稍后再试或直接终止进程。若只是某一包不响应，可以跳过当前包，升级完最后一包后，再回头补发。可以提高成功率，减少因为某些原因暂时中止导致的升级失败。</w:t>
+        <w:rPr>
+          <w:noProof/>
+        </w:rPr>
+        <w:drawing>
+          <wp:inline distT="0" distB="0" distL="0" distR="0" wp14:anchorId="5F1A480F" wp14:editId="0E4B4F27">
+            <wp:extent cx="5299238" cy="3625795"/>
+            <wp:effectExtent l="0" t="0" r="0" b="0"/>
+            <wp:docPr id="169" name="图片 169"/>
+            <wp:cNvGraphicFramePr>
+              <a:graphicFrameLocks xmlns:a="http://schemas.openxmlformats.org/drawingml/2006/main" noChangeAspect="1"/>
+            </wp:cNvGraphicFramePr>
+            <a:graphic xmlns:a="http://schemas.openxmlformats.org/drawingml/2006/main">
+              <a:graphicData uri="http://schemas.openxmlformats.org/drawingml/2006/picture">
+                <pic:pic xmlns:pic="http://schemas.openxmlformats.org/drawingml/2006/picture">
+                  <pic:nvPicPr>
+                    <pic:cNvPr id="0" name="Picture 1"/>
+                    <pic:cNvPicPr>
+                      <a:picLocks noChangeAspect="1" noChangeArrowheads="1"/>
+                    </pic:cNvPicPr>
+                  </pic:nvPicPr>
+                  <pic:blipFill rotWithShape="1">
+                    <a:blip r:embed="rId13">
+                      <a:extLst>
+                        <a:ext uri="{28A0092B-C50C-407E-A947-70E740481C1C}">
+                          <a14:useLocalDpi xmlns:a14="http://schemas.microsoft.com/office/drawing/2010/main" val="0"/>
+                        </a:ext>
+                      </a:extLst>
+                    </a:blip>
+                    <a:srcRect l="19173" t="32186" r="36844" b="10484"/>
+                    <a:stretch/>
+                  </pic:blipFill>
+                  <pic:spPr bwMode="auto">
+                    <a:xfrm>
+                      <a:off x="0" y="0"/>
+                      <a:ext cx="5304414" cy="3629337"/>
+                    </a:xfrm>
+                    <a:prstGeom prst="rect">
+                      <a:avLst/>
+                    </a:prstGeom>
+                    <a:noFill/>
+                    <a:ln>
+                      <a:noFill/>
+                    </a:ln>
+                    <a:extLst>
+                      <a:ext uri="{53640926-AAD7-44D8-BBD7-CCE9431645EC}">
+                        <a14:shadowObscured xmlns:a14="http://schemas.microsoft.com/office/drawing/2010/main"/>
+                      </a:ext>
+                    </a:extLst>
+                  </pic:spPr>
+                </pic:pic>
+              </a:graphicData>
+            </a:graphic>
+          </wp:inline>
+        </w:drawing>
       </w:r>
     </w:p>
     <w:p>
@@ -8590,701 +8535,310 @@
           <w:sz w:val="30"/>
           <w:szCs w:val="30"/>
         </w:rPr>
-        <w:t>设计一个通用性扩展性好的协议：</w:t>
+        <w:lastRenderedPageBreak/>
+        <w:t xml:space="preserve">EDA </w:t>
+      </w:r>
+      <w:r>
+        <w:rPr>
+          <w:rFonts w:hint="eastAsia"/>
+          <w:sz w:val="30"/>
+          <w:szCs w:val="30"/>
+        </w:rPr>
+        <w:t>原理图：</w:t>
+      </w:r>
+    </w:p>
+    <w:p>
+      <w:r>
+        <w:rPr>
+          <w:noProof/>
+        </w:rPr>
+        <w:drawing>
+          <wp:inline distT="0" distB="0" distL="0" distR="0" wp14:anchorId="35BBCBDB" wp14:editId="00886F59">
+            <wp:extent cx="5439103" cy="3550038"/>
+            <wp:effectExtent l="0" t="0" r="0" b="0"/>
+            <wp:docPr id="1091445623" name="图片 42"/>
+            <wp:cNvGraphicFramePr>
+              <a:graphicFrameLocks xmlns:a="http://schemas.openxmlformats.org/drawingml/2006/main" noChangeAspect="1"/>
+            </wp:cNvGraphicFramePr>
+            <a:graphic xmlns:a="http://schemas.openxmlformats.org/drawingml/2006/main">
+              <a:graphicData uri="http://schemas.openxmlformats.org/drawingml/2006/picture">
+                <pic:pic xmlns:pic="http://schemas.openxmlformats.org/drawingml/2006/picture">
+                  <pic:nvPicPr>
+                    <pic:cNvPr id="0" name="Picture 2"/>
+                    <pic:cNvPicPr>
+                      <a:picLocks noChangeAspect="1" noChangeArrowheads="1"/>
+                    </pic:cNvPicPr>
+                  </pic:nvPicPr>
+                  <pic:blipFill>
+                    <a:blip r:embed="rId14" cstate="print">
+                      <a:extLst>
+                        <a:ext uri="{28A0092B-C50C-407E-A947-70E740481C1C}">
+                          <a14:useLocalDpi xmlns:a14="http://schemas.microsoft.com/office/drawing/2010/main" val="0"/>
+                        </a:ext>
+                      </a:extLst>
+                    </a:blip>
+                    <a:srcRect/>
+                    <a:stretch>
+                      <a:fillRect/>
+                    </a:stretch>
+                  </pic:blipFill>
+                  <pic:spPr bwMode="auto">
+                    <a:xfrm>
+                      <a:off x="0" y="0"/>
+                      <a:ext cx="5501533" cy="3590785"/>
+                    </a:xfrm>
+                    <a:prstGeom prst="rect">
+                      <a:avLst/>
+                    </a:prstGeom>
+                    <a:noFill/>
+                  </pic:spPr>
+                </pic:pic>
+              </a:graphicData>
+            </a:graphic>
+          </wp:inline>
+        </w:drawing>
+      </w:r>
+    </w:p>
+    <w:p/>
+    <w:p>
+      <w:pPr>
+        <w:pStyle w:val="2"/>
+        <w:rPr>
+          <w:sz w:val="30"/>
+          <w:szCs w:val="30"/>
+        </w:rPr>
+      </w:pPr>
+      <w:r>
+        <w:rPr>
+          <w:rFonts w:hint="eastAsia"/>
+          <w:sz w:val="30"/>
+          <w:szCs w:val="30"/>
+        </w:rPr>
+        <w:t>使用串口与网关的交互：</w:t>
+      </w:r>
+    </w:p>
+    <w:p>
+      <w:r>
+        <w:rPr>
+          <w:rFonts w:hint="eastAsia"/>
+          <w:noProof/>
+        </w:rPr>
+        <w:drawing>
+          <wp:inline distT="0" distB="0" distL="0" distR="0" wp14:anchorId="0D245432" wp14:editId="45BEB1BF">
+            <wp:extent cx="5881687" cy="4912615"/>
+            <wp:effectExtent l="0" t="0" r="5080" b="2540"/>
+            <wp:docPr id="1078746871" name="图片 43"/>
+            <wp:cNvGraphicFramePr>
+              <a:graphicFrameLocks xmlns:a="http://schemas.openxmlformats.org/drawingml/2006/main" noChangeAspect="1"/>
+            </wp:cNvGraphicFramePr>
+            <a:graphic xmlns:a="http://schemas.openxmlformats.org/drawingml/2006/main">
+              <a:graphicData uri="http://schemas.openxmlformats.org/drawingml/2006/picture">
+                <pic:pic xmlns:pic="http://schemas.openxmlformats.org/drawingml/2006/picture">
+                  <pic:nvPicPr>
+                    <pic:cNvPr id="0" name="Picture 3"/>
+                    <pic:cNvPicPr>
+                      <a:picLocks noChangeAspect="1" noChangeArrowheads="1"/>
+                    </pic:cNvPicPr>
+                  </pic:nvPicPr>
+                  <pic:blipFill>
+                    <a:blip r:embed="rId15">
+                      <a:extLst>
+                        <a:ext uri="{28A0092B-C50C-407E-A947-70E740481C1C}">
+                          <a14:useLocalDpi xmlns:a14="http://schemas.microsoft.com/office/drawing/2010/main" val="0"/>
+                        </a:ext>
+                      </a:extLst>
+                    </a:blip>
+                    <a:srcRect/>
+                    <a:stretch>
+                      <a:fillRect/>
+                    </a:stretch>
+                  </pic:blipFill>
+                  <pic:spPr bwMode="auto">
+                    <a:xfrm>
+                      <a:off x="0" y="0"/>
+                      <a:ext cx="5884090" cy="4914622"/>
+                    </a:xfrm>
+                    <a:prstGeom prst="rect">
+                      <a:avLst/>
+                    </a:prstGeom>
+                    <a:noFill/>
+                    <a:ln>
+                      <a:noFill/>
+                    </a:ln>
+                  </pic:spPr>
+                </pic:pic>
+              </a:graphicData>
+            </a:graphic>
+          </wp:inline>
+        </w:drawing>
       </w:r>
     </w:p>
     <w:p>
       <w:pPr>
-        <w:ind w:firstLine="420"/>
-        <w:rPr>
-          <w:sz w:val="22"/>
+        <w:pStyle w:val="2"/>
+        <w:rPr>
+          <w:sz w:val="30"/>
+          <w:szCs w:val="30"/>
         </w:rPr>
       </w:pPr>
       <w:r>
         <w:rPr>
           <w:rFonts w:hint="eastAsia"/>
-          <w:sz w:val="22"/>
-        </w:rPr>
-        <w:t>设计思想主要是将通信双方抽象为一个可读可写的文件，通过协议的一些特殊定义，实现将不同的数据写入对方或从对方读取。同时考虑到协议后续的可扩展性，协议的帧格式不能定死，应该由不同的小块自由组合形成，还需要提供可以定义数据格式的方案。最终帧格式如表</w:t>
-      </w:r>
+          <w:sz w:val="30"/>
+          <w:szCs w:val="30"/>
+        </w:rPr>
+        <w:lastRenderedPageBreak/>
+        <w:t>使用</w:t>
+      </w:r>
+      <w:proofErr w:type="spellStart"/>
       <w:r>
         <w:rPr>
           <w:rFonts w:hint="eastAsia"/>
-          <w:sz w:val="22"/>
-        </w:rPr>
-        <w:t>1</w:t>
-      </w:r>
+          <w:sz w:val="30"/>
+          <w:szCs w:val="30"/>
+        </w:rPr>
+        <w:t>mqtt</w:t>
+      </w:r>
+      <w:proofErr w:type="spellEnd"/>
       <w:r>
         <w:rPr>
           <w:rFonts w:hint="eastAsia"/>
-          <w:sz w:val="22"/>
-        </w:rPr>
-        <w:t>：</w:t>
+          <w:sz w:val="30"/>
+          <w:szCs w:val="30"/>
+        </w:rPr>
+        <w:t>与网关的交互：</w:t>
       </w:r>
     </w:p>
     <w:p>
+      <w:r>
+        <w:rPr>
+          <w:rFonts w:hint="eastAsia"/>
+          <w:noProof/>
+        </w:rPr>
+        <w:drawing>
+          <wp:inline distT="0" distB="0" distL="0" distR="0" wp14:anchorId="3FB5B87A" wp14:editId="50981175">
+            <wp:extent cx="5600700" cy="2910852"/>
+            <wp:effectExtent l="0" t="0" r="0" b="3810"/>
+            <wp:docPr id="101532964" name="图片 41"/>
+            <wp:cNvGraphicFramePr>
+              <a:graphicFrameLocks xmlns:a="http://schemas.openxmlformats.org/drawingml/2006/main" noChangeAspect="1"/>
+            </wp:cNvGraphicFramePr>
+            <a:graphic xmlns:a="http://schemas.openxmlformats.org/drawingml/2006/main">
+              <a:graphicData uri="http://schemas.openxmlformats.org/drawingml/2006/picture">
+                <pic:pic xmlns:pic="http://schemas.openxmlformats.org/drawingml/2006/picture">
+                  <pic:nvPicPr>
+                    <pic:cNvPr id="0" name="Picture 1"/>
+                    <pic:cNvPicPr>
+                      <a:picLocks noChangeAspect="1" noChangeArrowheads="1"/>
+                    </pic:cNvPicPr>
+                  </pic:nvPicPr>
+                  <pic:blipFill>
+                    <a:blip r:embed="rId16">
+                      <a:extLst>
+                        <a:ext uri="{28A0092B-C50C-407E-A947-70E740481C1C}">
+                          <a14:useLocalDpi xmlns:a14="http://schemas.microsoft.com/office/drawing/2010/main" val="0"/>
+                        </a:ext>
+                      </a:extLst>
+                    </a:blip>
+                    <a:srcRect/>
+                    <a:stretch>
+                      <a:fillRect/>
+                    </a:stretch>
+                  </pic:blipFill>
+                  <pic:spPr bwMode="auto">
+                    <a:xfrm>
+                      <a:off x="0" y="0"/>
+                      <a:ext cx="5648508" cy="2935699"/>
+                    </a:xfrm>
+                    <a:prstGeom prst="rect">
+                      <a:avLst/>
+                    </a:prstGeom>
+                    <a:noFill/>
+                    <a:ln>
+                      <a:noFill/>
+                    </a:ln>
+                  </pic:spPr>
+                </pic:pic>
+              </a:graphicData>
+            </a:graphic>
+          </wp:inline>
+        </w:drawing>
+      </w:r>
+    </w:p>
+    <w:p/>
+    <w:p>
+      <w:r>
+        <w:rPr>
+          <w:rFonts w:hint="eastAsia"/>
+          <w:noProof/>
+        </w:rPr>
+        <w:drawing>
+          <wp:inline distT="0" distB="0" distL="0" distR="0" wp14:anchorId="0AB1AB8B" wp14:editId="5D0EB894">
+            <wp:extent cx="6111875" cy="3121025"/>
+            <wp:effectExtent l="0" t="0" r="3175" b="3175"/>
+            <wp:docPr id="225168869" name="图片 42"/>
+            <wp:cNvGraphicFramePr>
+              <a:graphicFrameLocks xmlns:a="http://schemas.openxmlformats.org/drawingml/2006/main" noChangeAspect="1"/>
+            </wp:cNvGraphicFramePr>
+            <a:graphic xmlns:a="http://schemas.openxmlformats.org/drawingml/2006/main">
+              <a:graphicData uri="http://schemas.openxmlformats.org/drawingml/2006/picture">
+                <pic:pic xmlns:pic="http://schemas.openxmlformats.org/drawingml/2006/picture">
+                  <pic:nvPicPr>
+                    <pic:cNvPr id="0" name="Picture 2"/>
+                    <pic:cNvPicPr>
+                      <a:picLocks noChangeAspect="1" noChangeArrowheads="1"/>
+                    </pic:cNvPicPr>
+                  </pic:nvPicPr>
+                  <pic:blipFill>
+                    <a:blip r:embed="rId17">
+                      <a:extLst>
+                        <a:ext uri="{28A0092B-C50C-407E-A947-70E740481C1C}">
+                          <a14:useLocalDpi xmlns:a14="http://schemas.microsoft.com/office/drawing/2010/main" val="0"/>
+                        </a:ext>
+                      </a:extLst>
+                    </a:blip>
+                    <a:srcRect/>
+                    <a:stretch>
+                      <a:fillRect/>
+                    </a:stretch>
+                  </pic:blipFill>
+                  <pic:spPr bwMode="auto">
+                    <a:xfrm>
+                      <a:off x="0" y="0"/>
+                      <a:ext cx="6111875" cy="3121025"/>
+                    </a:xfrm>
+                    <a:prstGeom prst="rect">
+                      <a:avLst/>
+                    </a:prstGeom>
+                    <a:noFill/>
+                    <a:ln>
+                      <a:noFill/>
+                    </a:ln>
+                  </pic:spPr>
+                </pic:pic>
+              </a:graphicData>
+            </a:graphic>
+          </wp:inline>
+        </w:drawing>
+      </w:r>
+    </w:p>
+    <w:p/>
+    <w:p/>
+    <w:p>
       <w:pPr>
-        <w:ind w:firstLine="420"/>
         <w:rPr>
           <w:sz w:val="22"/>
         </w:rPr>
       </w:pPr>
     </w:p>
-    <w:tbl>
-      <w:tblPr>
-        <w:tblStyle w:val="ab"/>
-        <w:tblW w:w="7806" w:type="dxa"/>
-        <w:jc w:val="center"/>
-        <w:tblLook w:val="04A0" w:firstRow="1" w:lastRow="0" w:firstColumn="1" w:lastColumn="0" w:noHBand="0" w:noVBand="1"/>
-      </w:tblPr>
-      <w:tblGrid>
-        <w:gridCol w:w="3553"/>
-        <w:gridCol w:w="4253"/>
-      </w:tblGrid>
-      <w:tr>
-        <w:trPr>
-          <w:trHeight w:val="157"/>
-          <w:jc w:val="center"/>
-        </w:trPr>
-        <w:tc>
-          <w:tcPr>
-            <w:tcW w:w="0" w:type="auto"/>
-            <w:vAlign w:val="center"/>
-          </w:tcPr>
-          <w:p>
-            <w:pPr>
-              <w:jc w:val="center"/>
-              <w:rPr>
-                <w:sz w:val="22"/>
-              </w:rPr>
-            </w:pPr>
-            <w:r>
-              <w:rPr>
-                <w:rFonts w:hint="eastAsia"/>
-                <w:sz w:val="22"/>
-              </w:rPr>
-              <w:t>6855</w:t>
-            </w:r>
-          </w:p>
-        </w:tc>
-        <w:tc>
-          <w:tcPr>
-            <w:tcW w:w="4253" w:type="dxa"/>
-            <w:vAlign w:val="center"/>
-          </w:tcPr>
-          <w:p>
-            <w:pPr>
-              <w:jc w:val="center"/>
-              <w:rPr>
-                <w:sz w:val="22"/>
-              </w:rPr>
-            </w:pPr>
-            <w:proofErr w:type="gramStart"/>
-            <w:r>
-              <w:rPr>
-                <w:rFonts w:hint="eastAsia"/>
-                <w:sz w:val="22"/>
-              </w:rPr>
-              <w:t>帧头</w:t>
-            </w:r>
-            <w:proofErr w:type="gramEnd"/>
-          </w:p>
-        </w:tc>
-      </w:tr>
-      <w:tr>
-        <w:trPr>
-          <w:trHeight w:val="157"/>
-          <w:jc w:val="center"/>
-        </w:trPr>
-        <w:tc>
-          <w:tcPr>
-            <w:tcW w:w="0" w:type="auto"/>
-            <w:vAlign w:val="center"/>
-          </w:tcPr>
-          <w:p>
-            <w:pPr>
-              <w:jc w:val="center"/>
-              <w:rPr>
-                <w:sz w:val="22"/>
-              </w:rPr>
-            </w:pPr>
-            <w:r>
-              <w:rPr>
-                <w:rFonts w:hint="eastAsia"/>
-                <w:sz w:val="22"/>
-              </w:rPr>
-              <w:t>FFFFFFFF</w:t>
-            </w:r>
-          </w:p>
-        </w:tc>
-        <w:tc>
-          <w:tcPr>
-            <w:tcW w:w="4253" w:type="dxa"/>
-            <w:vAlign w:val="center"/>
-          </w:tcPr>
-          <w:p>
-            <w:pPr>
-              <w:jc w:val="center"/>
-              <w:rPr>
-                <w:sz w:val="22"/>
-              </w:rPr>
-            </w:pPr>
-            <w:r>
-              <w:rPr>
-                <w:rFonts w:hint="eastAsia"/>
-                <w:sz w:val="22"/>
-              </w:rPr>
-              <w:t>唯一识别码：</w:t>
-            </w:r>
-            <w:r>
-              <w:rPr>
-                <w:sz w:val="22"/>
-              </w:rPr>
-              <w:t>Device</w:t>
-            </w:r>
-            <w:r>
-              <w:rPr>
-                <w:rFonts w:hint="eastAsia"/>
-                <w:sz w:val="22"/>
-              </w:rPr>
-              <w:t xml:space="preserve"> ID</w:t>
-            </w:r>
-          </w:p>
-        </w:tc>
-      </w:tr>
-      <w:tr>
-        <w:trPr>
-          <w:trHeight w:val="157"/>
-          <w:jc w:val="center"/>
-        </w:trPr>
-        <w:tc>
-          <w:tcPr>
-            <w:tcW w:w="0" w:type="auto"/>
-            <w:vAlign w:val="center"/>
-          </w:tcPr>
-          <w:p>
-            <w:pPr>
-              <w:jc w:val="center"/>
-              <w:rPr>
-                <w:sz w:val="22"/>
-              </w:rPr>
-            </w:pPr>
-            <w:r>
-              <w:rPr>
-                <w:rFonts w:hint="eastAsia"/>
-                <w:sz w:val="22"/>
-              </w:rPr>
-              <w:t>XXXX</w:t>
-            </w:r>
-          </w:p>
-        </w:tc>
-        <w:tc>
-          <w:tcPr>
-            <w:tcW w:w="4253" w:type="dxa"/>
-            <w:vAlign w:val="center"/>
-          </w:tcPr>
-          <w:p>
-            <w:pPr>
-              <w:jc w:val="center"/>
-              <w:rPr>
-                <w:sz w:val="22"/>
-              </w:rPr>
-            </w:pPr>
-            <w:r>
-              <w:rPr>
-                <w:rFonts w:hint="eastAsia"/>
-                <w:sz w:val="22"/>
-              </w:rPr>
-              <w:t>功能码：读</w:t>
-            </w:r>
-            <w:r>
-              <w:rPr>
-                <w:rFonts w:hint="eastAsia"/>
-                <w:sz w:val="22"/>
-              </w:rPr>
-              <w:t>/</w:t>
-            </w:r>
-            <w:r>
-              <w:rPr>
-                <w:rFonts w:hint="eastAsia"/>
-                <w:sz w:val="22"/>
-              </w:rPr>
-              <w:t>写</w:t>
-            </w:r>
-            <w:r>
-              <w:rPr>
-                <w:rFonts w:hint="eastAsia"/>
-                <w:sz w:val="22"/>
-              </w:rPr>
-              <w:t>/</w:t>
-            </w:r>
-            <w:r>
-              <w:rPr>
-                <w:rFonts w:hint="eastAsia"/>
-                <w:sz w:val="22"/>
-              </w:rPr>
-              <w:t>升级</w:t>
-            </w:r>
-          </w:p>
-        </w:tc>
-      </w:tr>
-      <w:tr>
-        <w:trPr>
-          <w:trHeight w:val="157"/>
-          <w:jc w:val="center"/>
-        </w:trPr>
-        <w:tc>
-          <w:tcPr>
-            <w:tcW w:w="0" w:type="auto"/>
-            <w:vAlign w:val="center"/>
-          </w:tcPr>
-          <w:p>
-            <w:pPr>
-              <w:jc w:val="center"/>
-              <w:rPr>
-                <w:sz w:val="22"/>
-              </w:rPr>
-            </w:pPr>
-            <w:r>
-              <w:rPr>
-                <w:rFonts w:hint="eastAsia"/>
-                <w:sz w:val="22"/>
-              </w:rPr>
-              <w:t>Len</w:t>
-            </w:r>
-          </w:p>
-        </w:tc>
-        <w:tc>
-          <w:tcPr>
-            <w:tcW w:w="4253" w:type="dxa"/>
-            <w:vAlign w:val="center"/>
-          </w:tcPr>
-          <w:p>
-            <w:pPr>
-              <w:jc w:val="center"/>
-              <w:rPr>
-                <w:sz w:val="22"/>
-              </w:rPr>
-            </w:pPr>
-            <w:r>
-              <w:rPr>
-                <w:rFonts w:hint="eastAsia"/>
-                <w:sz w:val="22"/>
-              </w:rPr>
-              <w:t>总长度：</w:t>
-            </w:r>
-            <w:r>
-              <w:rPr>
-                <w:rFonts w:hint="eastAsia"/>
-                <w:sz w:val="22"/>
-              </w:rPr>
-              <w:t>XXXX</w:t>
-            </w:r>
-          </w:p>
-        </w:tc>
-      </w:tr>
-      <w:tr>
-        <w:trPr>
-          <w:trHeight w:val="157"/>
-          <w:jc w:val="center"/>
-        </w:trPr>
-        <w:tc>
-          <w:tcPr>
-            <w:tcW w:w="0" w:type="auto"/>
-            <w:vAlign w:val="center"/>
-          </w:tcPr>
-          <w:p>
-            <w:pPr>
-              <w:jc w:val="center"/>
-              <w:rPr>
-                <w:sz w:val="22"/>
-              </w:rPr>
-            </w:pPr>
-            <w:r>
-              <w:rPr>
-                <w:rFonts w:hint="eastAsia"/>
-                <w:sz w:val="22"/>
-              </w:rPr>
-              <w:t>XX</w:t>
-            </w:r>
-          </w:p>
-        </w:tc>
-        <w:tc>
-          <w:tcPr>
-            <w:tcW w:w="4253" w:type="dxa"/>
-            <w:vAlign w:val="center"/>
-          </w:tcPr>
-          <w:p>
-            <w:pPr>
-              <w:jc w:val="center"/>
-              <w:rPr>
-                <w:sz w:val="22"/>
-              </w:rPr>
-            </w:pPr>
-            <w:r>
-              <w:rPr>
-                <w:rFonts w:hint="eastAsia"/>
-                <w:sz w:val="22"/>
-              </w:rPr>
-              <w:t>数据含义：</w:t>
-            </w:r>
-            <w:r>
-              <w:rPr>
-                <w:rFonts w:hint="eastAsia"/>
-                <w:sz w:val="22"/>
-              </w:rPr>
-              <w:t>Tag</w:t>
-            </w:r>
-          </w:p>
-        </w:tc>
-      </w:tr>
-      <w:tr>
-        <w:trPr>
-          <w:trHeight w:val="157"/>
-          <w:jc w:val="center"/>
-        </w:trPr>
-        <w:tc>
-          <w:tcPr>
-            <w:tcW w:w="0" w:type="auto"/>
-            <w:vAlign w:val="center"/>
-          </w:tcPr>
-          <w:p>
-            <w:pPr>
-              <w:jc w:val="center"/>
-              <w:rPr>
-                <w:sz w:val="22"/>
-              </w:rPr>
-            </w:pPr>
-            <w:r>
-              <w:rPr>
-                <w:rFonts w:hint="eastAsia"/>
-                <w:sz w:val="22"/>
-              </w:rPr>
-              <w:t>XXXX</w:t>
-            </w:r>
-          </w:p>
-        </w:tc>
-        <w:tc>
-          <w:tcPr>
-            <w:tcW w:w="4253" w:type="dxa"/>
-            <w:vAlign w:val="center"/>
-          </w:tcPr>
-          <w:p>
-            <w:pPr>
-              <w:jc w:val="center"/>
-              <w:rPr>
-                <w:sz w:val="22"/>
-              </w:rPr>
-            </w:pPr>
-            <w:r>
-              <w:rPr>
-                <w:rFonts w:hint="eastAsia"/>
-                <w:sz w:val="22"/>
-              </w:rPr>
-              <w:t>数据长度：</w:t>
-            </w:r>
-            <w:r>
-              <w:rPr>
-                <w:rFonts w:hint="eastAsia"/>
-                <w:sz w:val="22"/>
-              </w:rPr>
-              <w:t>XXXX</w:t>
-            </w:r>
-          </w:p>
-        </w:tc>
-      </w:tr>
-      <w:tr>
-        <w:trPr>
-          <w:trHeight w:val="157"/>
-          <w:jc w:val="center"/>
-        </w:trPr>
-        <w:tc>
-          <w:tcPr>
-            <w:tcW w:w="0" w:type="auto"/>
-            <w:vAlign w:val="center"/>
-          </w:tcPr>
-          <w:p>
-            <w:pPr>
-              <w:jc w:val="center"/>
-              <w:rPr>
-                <w:sz w:val="22"/>
-              </w:rPr>
-            </w:pPr>
-            <w:r>
-              <w:rPr>
-                <w:rFonts w:hint="eastAsia"/>
-                <w:sz w:val="22"/>
-              </w:rPr>
-              <w:t>XX</w:t>
-            </w:r>
-          </w:p>
-        </w:tc>
-        <w:tc>
-          <w:tcPr>
-            <w:tcW w:w="4253" w:type="dxa"/>
-            <w:vAlign w:val="center"/>
-          </w:tcPr>
-          <w:p>
-            <w:pPr>
-              <w:jc w:val="center"/>
-              <w:rPr>
-                <w:sz w:val="22"/>
-              </w:rPr>
-            </w:pPr>
-            <w:r>
-              <w:rPr>
-                <w:rFonts w:hint="eastAsia"/>
-                <w:sz w:val="22"/>
-              </w:rPr>
-              <w:t>数据类型：</w:t>
-            </w:r>
-            <w:r>
-              <w:rPr>
-                <w:rFonts w:hint="eastAsia"/>
-                <w:sz w:val="22"/>
-              </w:rPr>
-              <w:t>VIF</w:t>
-            </w:r>
-          </w:p>
-        </w:tc>
-      </w:tr>
-      <w:tr>
-        <w:trPr>
-          <w:trHeight w:val="153"/>
-          <w:jc w:val="center"/>
-        </w:trPr>
-        <w:tc>
-          <w:tcPr>
-            <w:tcW w:w="0" w:type="auto"/>
-            <w:vAlign w:val="center"/>
-          </w:tcPr>
-          <w:p>
-            <w:pPr>
-              <w:jc w:val="center"/>
-              <w:rPr>
-                <w:sz w:val="22"/>
-              </w:rPr>
-            </w:pPr>
-            <w:r>
-              <w:rPr>
-                <w:rFonts w:hint="eastAsia"/>
-                <w:sz w:val="22"/>
-              </w:rPr>
-              <w:t>XXXXXXXXXXXXXX</w:t>
-            </w:r>
-          </w:p>
-        </w:tc>
-        <w:tc>
-          <w:tcPr>
-            <w:tcW w:w="4253" w:type="dxa"/>
-            <w:vAlign w:val="center"/>
-          </w:tcPr>
-          <w:p>
-            <w:pPr>
-              <w:jc w:val="center"/>
-              <w:rPr>
-                <w:sz w:val="22"/>
-              </w:rPr>
-            </w:pPr>
-            <w:r>
-              <w:rPr>
-                <w:rFonts w:hint="eastAsia"/>
-                <w:sz w:val="22"/>
-              </w:rPr>
-              <w:t>数据</w:t>
-            </w:r>
-          </w:p>
-        </w:tc>
-      </w:tr>
-      <w:tr>
-        <w:trPr>
-          <w:trHeight w:val="157"/>
-          <w:jc w:val="center"/>
-        </w:trPr>
-        <w:tc>
-          <w:tcPr>
-            <w:tcW w:w="0" w:type="auto"/>
-            <w:vAlign w:val="center"/>
-          </w:tcPr>
-          <w:p>
-            <w:pPr>
-              <w:jc w:val="center"/>
-              <w:rPr>
-                <w:sz w:val="22"/>
-              </w:rPr>
-            </w:pPr>
-            <w:r>
-              <w:rPr>
-                <w:sz w:val="22"/>
-              </w:rPr>
-              <w:t>…</w:t>
-            </w:r>
-            <w:r>
-              <w:rPr>
-                <w:rFonts w:hint="eastAsia"/>
-                <w:sz w:val="22"/>
-              </w:rPr>
-              <w:t>..</w:t>
-            </w:r>
-          </w:p>
-        </w:tc>
-        <w:tc>
-          <w:tcPr>
-            <w:tcW w:w="4253" w:type="dxa"/>
-            <w:vAlign w:val="center"/>
-          </w:tcPr>
-          <w:p>
-            <w:pPr>
-              <w:jc w:val="center"/>
-              <w:rPr>
-                <w:sz w:val="22"/>
-              </w:rPr>
-            </w:pPr>
-            <w:r>
-              <w:rPr>
-                <w:sz w:val="22"/>
-              </w:rPr>
-              <w:t>…</w:t>
-            </w:r>
-            <w:r>
-              <w:rPr>
-                <w:rFonts w:hint="eastAsia"/>
-                <w:sz w:val="22"/>
-              </w:rPr>
-              <w:t>..</w:t>
-            </w:r>
-          </w:p>
-        </w:tc>
-      </w:tr>
-      <w:tr>
-        <w:trPr>
-          <w:trHeight w:val="157"/>
-          <w:jc w:val="center"/>
-        </w:trPr>
-        <w:tc>
-          <w:tcPr>
-            <w:tcW w:w="0" w:type="auto"/>
-            <w:vAlign w:val="center"/>
-          </w:tcPr>
-          <w:p>
-            <w:pPr>
-              <w:jc w:val="center"/>
-              <w:rPr>
-                <w:sz w:val="22"/>
-              </w:rPr>
-            </w:pPr>
-            <w:r>
-              <w:rPr>
-                <w:rFonts w:hint="eastAsia"/>
-                <w:sz w:val="22"/>
-              </w:rPr>
-              <w:t>XX</w:t>
-            </w:r>
-          </w:p>
-        </w:tc>
-        <w:tc>
-          <w:tcPr>
-            <w:tcW w:w="4253" w:type="dxa"/>
-            <w:vAlign w:val="center"/>
-          </w:tcPr>
-          <w:p>
-            <w:pPr>
-              <w:jc w:val="center"/>
-              <w:rPr>
-                <w:sz w:val="22"/>
-              </w:rPr>
-            </w:pPr>
-            <w:r>
-              <w:rPr>
-                <w:rFonts w:hint="eastAsia"/>
-                <w:sz w:val="22"/>
-              </w:rPr>
-              <w:t>校验</w:t>
-            </w:r>
-          </w:p>
-        </w:tc>
-      </w:tr>
-      <w:tr>
-        <w:trPr>
-          <w:trHeight w:val="161"/>
-          <w:jc w:val="center"/>
-        </w:trPr>
-        <w:tc>
-          <w:tcPr>
-            <w:tcW w:w="0" w:type="auto"/>
-            <w:vAlign w:val="center"/>
-          </w:tcPr>
-          <w:p>
-            <w:pPr>
-              <w:jc w:val="center"/>
-              <w:rPr>
-                <w:sz w:val="22"/>
-              </w:rPr>
-            </w:pPr>
-            <w:r>
-              <w:rPr>
-                <w:rFonts w:hint="eastAsia"/>
-                <w:sz w:val="22"/>
-              </w:rPr>
-              <w:t>16</w:t>
-            </w:r>
-          </w:p>
-        </w:tc>
-        <w:tc>
-          <w:tcPr>
-            <w:tcW w:w="4253" w:type="dxa"/>
-            <w:vAlign w:val="center"/>
-          </w:tcPr>
-          <w:p>
-            <w:pPr>
-              <w:jc w:val="center"/>
-              <w:rPr>
-                <w:sz w:val="22"/>
-              </w:rPr>
-            </w:pPr>
-            <w:proofErr w:type="gramStart"/>
-            <w:r>
-              <w:rPr>
-                <w:rFonts w:hint="eastAsia"/>
-                <w:sz w:val="22"/>
-              </w:rPr>
-              <w:t>帧尾</w:t>
-            </w:r>
-            <w:proofErr w:type="gramEnd"/>
-          </w:p>
-        </w:tc>
-      </w:tr>
-    </w:tbl>
-    <w:p>
-      <w:pPr>
-        <w:jc w:val="center"/>
-        <w:rPr>
-          <w:rFonts w:hint="eastAsia"/>
-          <w:sz w:val="22"/>
-        </w:rPr>
-      </w:pPr>
-      <w:r>
-        <w:rPr>
-          <w:rFonts w:hint="eastAsia"/>
-          <w:sz w:val="22"/>
-        </w:rPr>
-        <w:t>表</w:t>
-      </w:r>
-      <w:r>
-        <w:rPr>
-          <w:rFonts w:hint="eastAsia"/>
-          <w:sz w:val="22"/>
-        </w:rPr>
-        <w:t>1</w:t>
-      </w:r>
-    </w:p>
     <w:sectPr>
-      <w:headerReference w:type="even" r:id="rId10"/>
-      <w:headerReference w:type="default" r:id="rId11"/>
-      <w:footerReference w:type="even" r:id="rId12"/>
-      <w:footerReference w:type="default" r:id="rId13"/>
-      <w:headerReference w:type="first" r:id="rId14"/>
-      <w:footerReference w:type="first" r:id="rId15"/>
+      <w:headerReference w:type="even" r:id="rId18"/>
+      <w:headerReference w:type="default" r:id="rId19"/>
+      <w:footerReference w:type="even" r:id="rId20"/>
+      <w:footerReference w:type="default" r:id="rId21"/>
+      <w:headerReference w:type="first" r:id="rId22"/>
+      <w:footerReference w:type="first" r:id="rId23"/>
+      <w:type w:val="continuous"/>
       <w:pgSz w:w="11906" w:h="16838" w:code="9"/>
       <w:pgMar w:top="720" w:right="1133" w:bottom="720" w:left="1134" w:header="454" w:footer="567" w:gutter="0"/>
       <w:pgNumType w:start="0"/>
@@ -10015,6 +9569,92 @@
       </w:pPr>
     </w:lvl>
   </w:abstractNum>
+  <w:abstractNum w:abstractNumId="8" w15:restartNumberingAfterBreak="0">
+    <w:nsid w:val="5D50117E"/>
+    <w:multiLevelType w:val="hybridMultilevel"/>
+    <w:tmpl w:val="66FC5282"/>
+    <w:lvl w:ilvl="0" w:tplc="C562E6B0">
+      <w:start w:val="1"/>
+      <w:numFmt w:val="decimal"/>
+      <w:lvlText w:val="%1."/>
+      <w:lvlJc w:val="left"/>
+      <w:pPr>
+        <w:ind w:left="720" w:hanging="360"/>
+      </w:pPr>
+    </w:lvl>
+    <w:lvl w:ilvl="1" w:tplc="7172B4EE">
+      <w:start w:val="1"/>
+      <w:numFmt w:val="decimal"/>
+      <w:lvlText w:val="%2."/>
+      <w:lvlJc w:val="left"/>
+      <w:pPr>
+        <w:ind w:left="720" w:hanging="360"/>
+      </w:pPr>
+    </w:lvl>
+    <w:lvl w:ilvl="2" w:tplc="7DE41888">
+      <w:start w:val="1"/>
+      <w:numFmt w:val="decimal"/>
+      <w:lvlText w:val="%3."/>
+      <w:lvlJc w:val="left"/>
+      <w:pPr>
+        <w:ind w:left="720" w:hanging="360"/>
+      </w:pPr>
+    </w:lvl>
+    <w:lvl w:ilvl="3" w:tplc="7EC48654">
+      <w:start w:val="1"/>
+      <w:numFmt w:val="decimal"/>
+      <w:lvlText w:val="%4."/>
+      <w:lvlJc w:val="left"/>
+      <w:pPr>
+        <w:ind w:left="720" w:hanging="360"/>
+      </w:pPr>
+    </w:lvl>
+    <w:lvl w:ilvl="4" w:tplc="C55CD3AA">
+      <w:start w:val="1"/>
+      <w:numFmt w:val="decimal"/>
+      <w:lvlText w:val="%5."/>
+      <w:lvlJc w:val="left"/>
+      <w:pPr>
+        <w:ind w:left="720" w:hanging="360"/>
+      </w:pPr>
+    </w:lvl>
+    <w:lvl w:ilvl="5" w:tplc="AD900022">
+      <w:start w:val="1"/>
+      <w:numFmt w:val="decimal"/>
+      <w:lvlText w:val="%6."/>
+      <w:lvlJc w:val="left"/>
+      <w:pPr>
+        <w:ind w:left="720" w:hanging="360"/>
+      </w:pPr>
+    </w:lvl>
+    <w:lvl w:ilvl="6" w:tplc="8C4A57BC">
+      <w:start w:val="1"/>
+      <w:numFmt w:val="decimal"/>
+      <w:lvlText w:val="%7."/>
+      <w:lvlJc w:val="left"/>
+      <w:pPr>
+        <w:ind w:left="720" w:hanging="360"/>
+      </w:pPr>
+    </w:lvl>
+    <w:lvl w:ilvl="7" w:tplc="1EA2A148">
+      <w:start w:val="1"/>
+      <w:numFmt w:val="decimal"/>
+      <w:lvlText w:val="%8."/>
+      <w:lvlJc w:val="left"/>
+      <w:pPr>
+        <w:ind w:left="720" w:hanging="360"/>
+      </w:pPr>
+    </w:lvl>
+    <w:lvl w:ilvl="8" w:tplc="C6426670">
+      <w:start w:val="1"/>
+      <w:numFmt w:val="decimal"/>
+      <w:lvlText w:val="%9."/>
+      <w:lvlJc w:val="left"/>
+      <w:pPr>
+        <w:ind w:left="720" w:hanging="360"/>
+      </w:pPr>
+    </w:lvl>
+  </w:abstractNum>
   <w:num w:numId="1" w16cid:durableId="2146120836">
     <w:abstractNumId w:val="5"/>
   </w:num>
@@ -10038,6 +9678,9 @@
   </w:num>
   <w:num w:numId="8" w16cid:durableId="1020160832">
     <w:abstractNumId w:val="0"/>
+  </w:num>
+  <w:num w:numId="9" w16cid:durableId="535197668">
+    <w:abstractNumId w:val="8"/>
   </w:num>
 </w:numbering>
 </file>
@@ -10486,6 +10129,7 @@
   <w:style w:type="character" w:default="1" w:styleId="a0">
     <w:name w:val="Default Paragraph Font"/>
     <w:uiPriority w:val="1"/>
+    <w:semiHidden/>
     <w:unhideWhenUsed/>
   </w:style>
   <w:style w:type="table" w:default="1" w:styleId="a1">
@@ -10680,6 +10324,70 @@
       <w:kern w:val="44"/>
       <w:sz w:val="28"/>
       <w:szCs w:val="44"/>
+    </w:rPr>
+  </w:style>
+  <w:style w:type="character" w:styleId="ac">
+    <w:name w:val="annotation reference"/>
+    <w:basedOn w:val="a0"/>
+    <w:uiPriority w:val="99"/>
+    <w:semiHidden/>
+    <w:unhideWhenUsed/>
+    <w:rsid w:val="00AD0C9B"/>
+    <w:rPr>
+      <w:sz w:val="21"/>
+      <w:szCs w:val="21"/>
+    </w:rPr>
+  </w:style>
+  <w:style w:type="paragraph" w:styleId="ad">
+    <w:name w:val="annotation text"/>
+    <w:basedOn w:val="a"/>
+    <w:link w:val="ae"/>
+    <w:uiPriority w:val="99"/>
+    <w:unhideWhenUsed/>
+    <w:rsid w:val="00AD0C9B"/>
+    <w:pPr>
+      <w:jc w:val="left"/>
+    </w:pPr>
+  </w:style>
+  <w:style w:type="character" w:customStyle="1" w:styleId="ae">
+    <w:name w:val="批注文字 字符"/>
+    <w:basedOn w:val="a0"/>
+    <w:link w:val="ad"/>
+    <w:uiPriority w:val="99"/>
+    <w:rsid w:val="00AD0C9B"/>
+    <w:rPr>
+      <w:kern w:val="2"/>
+      <w:sz w:val="21"/>
+      <w:szCs w:val="22"/>
+    </w:rPr>
+  </w:style>
+  <w:style w:type="paragraph" w:styleId="af">
+    <w:name w:val="annotation subject"/>
+    <w:basedOn w:val="ad"/>
+    <w:next w:val="ad"/>
+    <w:link w:val="af0"/>
+    <w:uiPriority w:val="99"/>
+    <w:semiHidden/>
+    <w:unhideWhenUsed/>
+    <w:rsid w:val="00AD0C9B"/>
+    <w:rPr>
+      <w:b/>
+      <w:bCs/>
+    </w:rPr>
+  </w:style>
+  <w:style w:type="character" w:customStyle="1" w:styleId="af0">
+    <w:name w:val="批注主题 字符"/>
+    <w:basedOn w:val="ae"/>
+    <w:link w:val="af"/>
+    <w:uiPriority w:val="99"/>
+    <w:semiHidden/>
+    <w:rsid w:val="00AD0C9B"/>
+    <w:rPr>
+      <w:b/>
+      <w:bCs/>
+      <w:kern w:val="2"/>
+      <w:sz w:val="21"/>
+      <w:szCs w:val="22"/>
     </w:rPr>
   </w:style>
 </w:styles>

</xml_diff>

<commit_message>
Thu Feb 26 19:31:27 CST 2026
</commit_message>
<xml_diff>
--- a/send_Hr/简历A.docx
+++ b/send_Hr/简历A.docx
@@ -1346,9 +1346,148 @@
           <w:noProof/>
         </w:rPr>
         <mc:AlternateContent>
+          <mc:Choice Requires="wps">
+            <w:drawing>
+              <wp:anchor distT="0" distB="0" distL="114300" distR="114300" simplePos="0" relativeHeight="251728896" behindDoc="0" locked="0" layoutInCell="1" allowOverlap="1" wp14:anchorId="78403FFB" wp14:editId="2FAD7D63">
+                <wp:simplePos x="0" y="0"/>
+                <wp:positionH relativeFrom="column">
+                  <wp:posOffset>-705394</wp:posOffset>
+                </wp:positionH>
+                <wp:positionV relativeFrom="paragraph">
+                  <wp:posOffset>7646670</wp:posOffset>
+                </wp:positionV>
+                <wp:extent cx="7505700" cy="1985010"/>
+                <wp:effectExtent l="38100" t="114300" r="133350" b="53340"/>
+                <wp:wrapNone/>
+                <wp:docPr id="209" name="流程图: 手动输入 2"/>
+                <wp:cNvGraphicFramePr/>
+                <a:graphic xmlns:a="http://schemas.openxmlformats.org/drawingml/2006/main">
+                  <a:graphicData uri="http://schemas.microsoft.com/office/word/2010/wordprocessingShape">
+                    <wps:wsp>
+                      <wps:cNvSpPr/>
+                      <wps:spPr>
+                        <a:xfrm flipH="1">
+                          <a:off x="0" y="0"/>
+                          <a:ext cx="7505700" cy="1985010"/>
+                        </a:xfrm>
+                        <a:custGeom>
+                          <a:avLst/>
+                          <a:gdLst>
+                            <a:gd name="connsiteX0" fmla="*/ 0 w 10000"/>
+                            <a:gd name="connsiteY0" fmla="*/ 2286 h 10000"/>
+                            <a:gd name="connsiteX1" fmla="*/ 10000 w 10000"/>
+                            <a:gd name="connsiteY1" fmla="*/ 0 h 10000"/>
+                            <a:gd name="connsiteX2" fmla="*/ 10000 w 10000"/>
+                            <a:gd name="connsiteY2" fmla="*/ 10000 h 10000"/>
+                            <a:gd name="connsiteX3" fmla="*/ 0 w 10000"/>
+                            <a:gd name="connsiteY3" fmla="*/ 10000 h 10000"/>
+                            <a:gd name="connsiteX4" fmla="*/ 0 w 10000"/>
+                            <a:gd name="connsiteY4" fmla="*/ 2286 h 10000"/>
+                          </a:gdLst>
+                          <a:ahLst/>
+                          <a:cxnLst>
+                            <a:cxn ang="0">
+                              <a:pos x="connsiteX0" y="connsiteY0"/>
+                            </a:cxn>
+                            <a:cxn ang="0">
+                              <a:pos x="connsiteX1" y="connsiteY1"/>
+                            </a:cxn>
+                            <a:cxn ang="0">
+                              <a:pos x="connsiteX2" y="connsiteY2"/>
+                            </a:cxn>
+                            <a:cxn ang="0">
+                              <a:pos x="connsiteX3" y="connsiteY3"/>
+                            </a:cxn>
+                            <a:cxn ang="0">
+                              <a:pos x="connsiteX4" y="connsiteY4"/>
+                            </a:cxn>
+                          </a:cxnLst>
+                          <a:rect l="l" t="t" r="r" b="b"/>
+                          <a:pathLst>
+                            <a:path w="10000" h="10000">
+                              <a:moveTo>
+                                <a:pt x="0" y="2286"/>
+                              </a:moveTo>
+                              <a:lnTo>
+                                <a:pt x="10000" y="0"/>
+                              </a:lnTo>
+                              <a:lnTo>
+                                <a:pt x="10000" y="10000"/>
+                              </a:lnTo>
+                              <a:lnTo>
+                                <a:pt x="0" y="10000"/>
+                              </a:lnTo>
+                              <a:lnTo>
+                                <a:pt x="0" y="2286"/>
+                              </a:lnTo>
+                              <a:close/>
+                            </a:path>
+                          </a:pathLst>
+                        </a:custGeom>
+                        <a:solidFill>
+                          <a:srgbClr val="5290BF"/>
+                        </a:solidFill>
+                        <a:ln w="12700" cap="flat" cmpd="sng" algn="ctr">
+                          <a:solidFill>
+                            <a:srgbClr val="5290BF"/>
+                          </a:solidFill>
+                          <a:prstDash val="solid"/>
+                          <a:miter lim="800000"/>
+                        </a:ln>
+                        <a:effectLst>
+                          <a:outerShdw blurRad="63500" dist="50800" dir="18900000" algn="bl" rotWithShape="0">
+                            <a:prstClr val="black">
+                              <a:alpha val="16000"/>
+                            </a:prstClr>
+                          </a:outerShdw>
+                        </a:effectLst>
+                      </wps:spPr>
+                      <wps:txbx>
+                        <w:txbxContent>
+                          <w:p/>
+                        </w:txbxContent>
+                      </wps:txbx>
+                      <wps:bodyPr rot="0" spcFirstLastPara="0" vertOverflow="overflow" horzOverflow="overflow" vert="horz" wrap="square" lIns="91440" tIns="45720" rIns="91440" bIns="45720" numCol="1" spcCol="0" rtlCol="0" fromWordArt="0" anchor="ctr" anchorCtr="0" forceAA="0" compatLnSpc="1">
+                        <a:noAutofit/>
+                      </wps:bodyPr>
+                    </wps:wsp>
+                  </a:graphicData>
+                </a:graphic>
+                <wp14:sizeRelH relativeFrom="margin">
+                  <wp14:pctWidth>0</wp14:pctWidth>
+                </wp14:sizeRelH>
+                <wp14:sizeRelV relativeFrom="margin">
+                  <wp14:pctHeight>0</wp14:pctHeight>
+                </wp14:sizeRelV>
+              </wp:anchor>
+            </w:drawing>
+          </mc:Choice>
+          <mc:Fallback>
+            <w:pict>
+              <v:shape w14:anchorId="78403FFB" id="流程图: 手动输入 2" o:spid="_x0000_s1031" style="position:absolute;margin-left:-55.55pt;margin-top:602.1pt;width:591pt;height:156.3pt;flip:x;z-index:251728896;visibility:visible;mso-wrap-style:square;mso-width-percent:0;mso-height-percent:0;mso-wrap-distance-left:9pt;mso-wrap-distance-top:0;mso-wrap-distance-right:9pt;mso-wrap-distance-bottom:0;mso-position-horizontal:absolute;mso-position-horizontal-relative:text;mso-position-vertical:absolute;mso-position-vertical-relative:text;mso-width-percent:0;mso-height-percent:0;mso-width-relative:margin;mso-height-relative:margin;v-text-anchor:middle" coordsize="10000,10000" o:spt="100" o:gfxdata="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" adj="-11796480,,5400" path="m,2286l10000,r,10000l,10000,,2286xe" fillcolor="#5290bf" strokecolor="#5290bf" strokeweight="1pt">
+                <v:stroke joinstyle="miter"/>
+                <v:shadow on="t" color="black" opacity="10485f" origin="-.5,.5" offset=".99781mm,-.99781mm"/>
+                <v:formulas/>
+                <v:path arrowok="t" o:connecttype="custom" o:connectlocs="0,453773;7505700,0;7505700,1985010;0,1985010;0,453773" o:connectangles="0,0,0,0,0" textboxrect="0,0,10000,10000"/>
+                <v:textbox>
+                  <w:txbxContent>
+                    <w:p/>
+                  </w:txbxContent>
+                </v:textbox>
+              </v:shape>
+            </w:pict>
+          </mc:Fallback>
+        </mc:AlternateContent>
+      </w:r>
+      <w:r>
+        <w:rPr>
+          <w:rFonts w:ascii="微软雅黑" w:eastAsia="微软雅黑" w:hAnsi="微软雅黑"/>
+          <w:noProof/>
+        </w:rPr>
+        <mc:AlternateContent>
           <mc:Choice Requires="wpg">
             <w:drawing>
-              <wp:anchor distT="0" distB="0" distL="114300" distR="114300" simplePos="0" relativeHeight="251735040" behindDoc="0" locked="0" layoutInCell="1" allowOverlap="1" wp14:anchorId="3FE94003" wp14:editId="61F5945F">
+              <wp:anchor distT="0" distB="0" distL="114300" distR="114300" simplePos="0" relativeHeight="251735040" behindDoc="0" locked="0" layoutInCell="1" allowOverlap="1" wp14:anchorId="3FE94003" wp14:editId="66E81D76">
                 <wp:simplePos x="0" y="0"/>
                 <wp:positionH relativeFrom="column">
                   <wp:posOffset>3952</wp:posOffset>
@@ -2208,16 +2347,7 @@
                                       <w:sz w:val="28"/>
                                       <w:szCs w:val="28"/>
                                     </w:rPr>
-                                    <w:t>（</w:t>
-                                  </w:r>
-                                  <w:r>
-                                    <w:rPr>
-                                      <w:rFonts w:ascii="微软雅黑" w:eastAsia="微软雅黑" w:hAnsi="微软雅黑" w:hint="eastAsia"/>
-                                      <w:color w:val="7F7F7F" w:themeColor="text1" w:themeTint="80"/>
-                                      <w:sz w:val="28"/>
-                                      <w:szCs w:val="28"/>
-                                    </w:rPr>
-                                    <w:t>有二级证书）</w:t>
+                                    <w:t>（有二级证书）</w:t>
                                   </w:r>
                                 </w:p>
                                 <w:p>
@@ -4283,10 +4413,10 @@
           </mc:Choice>
           <mc:Fallback>
             <w:pict>
-              <v:group w14:anchorId="3FE94003" id="组合 41" o:spid="_x0000_s1031" style="position:absolute;margin-left:.3pt;margin-top:125.1pt;width:507.65pt;height:457pt;z-index:251735040;mso-width-relative:margin" coordsize="64478,58039" o:gfxdata="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">
-                <v:group id="组合 845807069" o:spid="_x0000_s1032" style="position:absolute;left:32004;top:190;width:32474;height:53790" coordorigin=",-250" coordsize="39184,60935" o:gfxdata="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">
-                  <v:group id="组合 1296834415" o:spid="_x0000_s1033" style="position:absolute;top:-250;width:37084;height:25659" coordorigin=",-295" coordsize="37090,30358" o:gfxdata="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">
-                    <v:shape id="文本框 415746563" o:spid="_x0000_s1034" type="#_x0000_t202" style="position:absolute;top:4612;width:37090;height:25450;visibility:visible;mso-wrap-style:square;v-text-anchor:top" o:gfxdata="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" filled="f" stroked="f" strokeweight=".5pt">
+              <v:group w14:anchorId="3FE94003" id="组合 41" o:spid="_x0000_s1032" style="position:absolute;margin-left:.3pt;margin-top:125.1pt;width:507.65pt;height:457pt;z-index:251735040;mso-width-relative:margin" coordsize="64478,58039" o:gfxdata="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">
+                <v:group id="组合 845807069" o:spid="_x0000_s1033" style="position:absolute;left:32004;top:190;width:32474;height:53790" coordorigin=",-250" coordsize="39184,60935" o:gfxdata="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">
+                  <v:group id="组合 1296834415" o:spid="_x0000_s1034" style="position:absolute;top:-250;width:37084;height:25659" coordorigin=",-295" coordsize="37090,30358" o:gfxdata="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">
+                    <v:shape id="文本框 415746563" o:spid="_x0000_s1035" type="#_x0000_t202" style="position:absolute;top:4612;width:37090;height:25450;visibility:visible;mso-wrap-style:square;v-text-anchor:top" o:gfxdata="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" filled="f" stroked="f" strokeweight=".5pt">
                       <v:textbox>
                         <w:txbxContent>
                           <w:p>
@@ -4498,11 +4628,11 @@
                         </w:txbxContent>
                       </v:textbox>
                     </v:shape>
-                    <v:group id="组合 644909588" o:spid="_x0000_s1035" style="position:absolute;left:380;top:-295;width:24077;height:4373" coordorigin="10102,4463" coordsize="3795,547" o:gfxdata="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">
-                      <v:rect id="_x0000_s1036" style="position:absolute;left:10102;top:4500;width:3795;height:510;flip:x;visibility:visible;mso-wrap-style:square;v-text-anchor:middle" o:gfxdata="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" fillcolor="#5290bf" strokecolor="#5290bf" strokeweight="1pt">
+                    <v:group id="组合 644909588" o:spid="_x0000_s1036" style="position:absolute;left:380;top:-295;width:24077;height:4373" coordorigin="10102,4463" coordsize="3795,547" o:gfxdata="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">
+                      <v:rect id="_x0000_s1037" style="position:absolute;left:10102;top:4500;width:3795;height:510;flip:x;visibility:visible;mso-wrap-style:square;v-text-anchor:middle" o:gfxdata="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" fillcolor="#5290bf" strokecolor="#5290bf" strokeweight="1pt">
                         <v:shadow on="t" color="black" opacity="26214f" origin="-.5,-.5" offset=".74836mm,.74836mm"/>
                       </v:rect>
-                      <v:shape id="文本框 10" o:spid="_x0000_s1037" type="#_x0000_t202" style="position:absolute;left:10721;top:4463;width:2475;height:510;visibility:visible;mso-wrap-style:square;v-text-anchor:top" o:gfxdata="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" filled="f" stroked="f" strokeweight=".5pt">
+                      <v:shape id="文本框 10" o:spid="_x0000_s1038" type="#_x0000_t202" style="position:absolute;left:10721;top:4463;width:2475;height:510;visibility:visible;mso-wrap-style:square;v-text-anchor:top" o:gfxdata="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" filled="f" stroked="f" strokeweight=".5pt">
                         <v:textbox>
                           <w:txbxContent>
                             <w:p>
@@ -4530,13 +4660,13 @@
                           </w:txbxContent>
                         </v:textbox>
                       </v:shape>
-                      <v:shape id="学士帽" o:spid="_x0000_s1038" style="position:absolute;left:10345;top:4604;width:426;height:288;visibility:visible;mso-wrap-style:square;v-text-anchor:middle-center" coordsize="3931,2392" o:gfxdata="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" path="m3046,1287v,,-428,-437,-1019,-437c1450,850,880,1287,880,1287,560,1154,560,1154,560,1154v,392,,392,,392c610,1563,647,1610,647,1666v,57,-38,103,-89,120c653,2208,653,2208,653,2208v-280,,-280,,-280,c469,1784,469,1784,469,1784v-46,-20,-78,-65,-78,-118c391,1614,422,1570,466,1549v,-434,,-434,,-434c,920,,920,,920,2050,,2050,,2050,,3931,932,3931,932,3931,932r-885,355xm2004,1072v594,,925,314,925,314c2929,2147,2929,2147,2929,2147v,,-343,245,-972,245c1328,2392,1099,2147,1099,2147v,-761,,-761,,-761c1099,1386,1410,1072,2004,1072xm1992,2252v412,,746,-84,746,-186c2738,1963,2404,1879,1992,1879v-411,,-745,84,-745,187c1247,2168,1581,2252,1992,2252xe" fillcolor="window" stroked="f">
+                      <v:shape id="学士帽" o:spid="_x0000_s1039" style="position:absolute;left:10345;top:4604;width:426;height:288;visibility:visible;mso-wrap-style:square;v-text-anchor:middle-center" coordsize="3931,2392" o:gfxdata="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" path="m3046,1287v,,-428,-437,-1019,-437c1450,850,880,1287,880,1287,560,1154,560,1154,560,1154v,392,,392,,392c610,1563,647,1610,647,1666v,57,-38,103,-89,120c653,2208,653,2208,653,2208v-280,,-280,,-280,c469,1784,469,1784,469,1784v-46,-20,-78,-65,-78,-118c391,1614,422,1570,466,1549v,-434,,-434,,-434c,920,,920,,920,2050,,2050,,2050,,3931,932,3931,932,3931,932r-885,355xm2004,1072v594,,925,314,925,314c2929,2147,2929,2147,2929,2147v,,-343,245,-972,245c1328,2392,1099,2147,1099,2147v,-761,,-761,,-761c1099,1386,1410,1072,2004,1072xm1992,2252v412,,746,-84,746,-186c2738,1963,2404,1879,1992,1879v-411,,-745,84,-745,187c1247,2168,1581,2252,1992,2252xe" fillcolor="window" stroked="f">
                         <v:path arrowok="t" o:connecttype="custom" o:connectlocs="151183,71004;100606,46894;43677,71004;27795,63666;27795,85293;32113,91913;27695,98533;32410,121815;18513,121815;23278,98423;19407,91913;23129,85458;23129,61514;0,50756;101748,0;195108,51418;151183,71004;99465,59142;145375,76465;145375,118450;97132,131966;54547,118450;54547,76465;99465,59142;98869,124243;135896,113981;98869,103664;61893,113981;98869,124243" o:connectangles="0,0,0,0,0,0,0,0,0,0,0,0,0,0,0,0,0,0,0,0,0,0,0,0,0,0,0,0,0"/>
                       </v:shape>
                     </v:group>
                   </v:group>
-                  <v:group id="组合 1948591548" o:spid="_x0000_s1039" style="position:absolute;left:690;top:26457;width:38494;height:34228" coordorigin="500,6468" coordsize="38500,34231" o:gfxdata="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">
-                    <v:rect id="_x0000_s1040" style="position:absolute;left:500;top:6599;width:24041;height:3968;flip:x;visibility:visible;mso-wrap-style:square;v-text-anchor:middle" o:gfxdata="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" fillcolor="#5290bf" strokecolor="#5290bf" strokeweight="1pt">
+                  <v:group id="组合 1948591548" o:spid="_x0000_s1040" style="position:absolute;left:690;top:26457;width:38494;height:34228" coordorigin="500,6468" coordsize="38500,34231" o:gfxdata="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">
+                    <v:rect id="_x0000_s1041" style="position:absolute;left:500;top:6599;width:24041;height:3968;flip:x;visibility:visible;mso-wrap-style:square;v-text-anchor:middle" o:gfxdata="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" fillcolor="#5290bf" strokecolor="#5290bf" strokeweight="1pt">
                       <v:shadow on="t" color="black" opacity="26214f" origin="-.5,-.5" offset=".74836mm,.74836mm"/>
                       <v:textbox>
                         <w:txbxContent>
@@ -4544,7 +4674,7 @@
                         </w:txbxContent>
                       </v:textbox>
                     </v:rect>
-                    <v:shape id="文本框 167241640" o:spid="_x0000_s1041" type="#_x0000_t202" style="position:absolute;left:4936;top:6468;width:14883;height:3808;visibility:visible;mso-wrap-style:square;v-text-anchor:top" o:gfxdata="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" filled="f" stroked="f" strokeweight=".5pt">
+                    <v:shape id="文本框 167241640" o:spid="_x0000_s1042" type="#_x0000_t202" style="position:absolute;left:4936;top:6468;width:14883;height:3808;visibility:visible;mso-wrap-style:square;v-text-anchor:top" o:gfxdata="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" filled="f" stroked="f" strokeweight=".5pt">
                       <v:textbox>
                         <w:txbxContent>
                           <w:p>
@@ -4571,7 +4701,7 @@
                         </w:txbxContent>
                       </v:textbox>
                     </v:shape>
-                    <v:shape id="文本框 110433329" o:spid="_x0000_s1042" type="#_x0000_t202" style="position:absolute;left:500;top:11321;width:38500;height:29379;visibility:visible;mso-wrap-style:square;v-text-anchor:top" o:gfxdata="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" filled="f" stroked="f" strokeweight=".5pt">
+                    <v:shape id="文本框 110433329" o:spid="_x0000_s1043" type="#_x0000_t202" style="position:absolute;left:500;top:11321;width:38500;height:29379;visibility:visible;mso-wrap-style:square;v-text-anchor:top" o:gfxdata="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" filled="f" stroked="f" strokeweight=".5pt">
                       <v:textbox>
                         <w:txbxContent>
                           <w:p>
@@ -4605,16 +4735,7 @@
                                 <w:sz w:val="28"/>
                                 <w:szCs w:val="28"/>
                               </w:rPr>
-                              <w:t>（</w:t>
-                            </w:r>
-                            <w:r>
-                              <w:rPr>
-                                <w:rFonts w:ascii="微软雅黑" w:eastAsia="微软雅黑" w:hAnsi="微软雅黑" w:hint="eastAsia"/>
-                                <w:color w:val="7F7F7F" w:themeColor="text1" w:themeTint="80"/>
-                                <w:sz w:val="28"/>
-                                <w:szCs w:val="28"/>
-                              </w:rPr>
-                              <w:t>有二级证书）</w:t>
+                              <w:t>（有二级证书）</w:t>
                             </w:r>
                           </w:p>
                           <w:p>
@@ -4833,14 +4954,14 @@
                         </w:txbxContent>
                       </v:textbox>
                     </v:shape>
-                    <v:shape id="公告栏" o:spid="_x0000_s1043" style="position:absolute;left:2335;top:7344;width:2305;height:2101;visibility:visible;mso-wrap-style:square;v-text-anchor:middle" coordsize="5438,5494" o:gfxdata="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" path="m2825,454l2825,,2514,r,454l,454r,805l276,1259r,3036l2197,4295,1028,5252r197,242l2689,4295r10,l4163,5494r197,-242l3192,4295r1913,l5105,1259r333,l5438,454r-2613,xm4793,3983r-4206,l587,1259r4206,l4793,3983xm1611,3281r,-810l2422,2471r-2,-42l2417,2388r-5,-41l2405,2308r-9,-40l2385,2230r-12,-38l2358,2156r-17,-36l2324,2085r-20,-34l2284,2018r-24,-32l2237,1956r-27,-30l2184,1898r-28,-27l2126,1846r-30,-24l2064,1799r-33,-21l1997,1759r-35,-18l1926,1724r-36,-14l1852,1697r-38,-11l1774,1677r-39,-7l1694,1665r-41,-3l1611,1660r-42,2l1528,1665r-41,5l1448,1677r-40,9l1369,1697r-37,13l1295,1724r-35,17l1224,1759r-33,19l1157,1799r-31,23l1096,1846r-30,25l1038,1898r-27,28l986,1956r-24,30l939,2018r-21,33l899,2085r-18,35l864,2156r-14,36l837,2230r-11,38l817,2308r-8,39l804,2388r-3,41l800,2471r1,42l804,2554r5,41l817,2634r9,40l837,2712r13,38l864,2786r17,36l899,2857r19,34l939,2924r23,32l986,2986r25,30l1038,3044r28,26l1096,3097r30,23l1157,3144r34,20l1224,3184r36,17l1295,3218r37,15l1369,3245r39,11l1448,3265r39,7l1528,3277r41,3l1611,3281xm1838,3503r,l1881,3502r40,-3l1962,3493r40,-7l2041,3477r39,-11l2117,3453r37,-14l2190,3422r35,-18l2259,3385r33,-21l2323,3341r32,-24l2384,3292r27,-27l2439,3237r25,-30l2488,3177r23,-31l2532,3112r19,-33l2570,3043r16,-35l2600,2971r12,-38l2623,2895r10,-40l2640,2816r5,-41l2648,2734r1,-42l1838,2692r,811xm4318,1839r-1037,l3281,2150r1037,l4318,1839xm4318,2411r-1037,l3281,2723r1037,l4318,2411xm4318,2983r-1037,l3281,3295r1037,l4318,2983xe" fillcolor="window" stroked="f">
+                    <v:shape id="公告栏" o:spid="_x0000_s1044" style="position:absolute;left:2335;top:7344;width:2305;height:2101;visibility:visible;mso-wrap-style:square;v-text-anchor:middle" coordsize="5438,5494" o:gfxdata="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" path="m2825,454l2825,,2514,r,454l,454r,805l276,1259r,3036l2197,4295,1028,5252r197,242l2689,4295r10,l4163,5494r197,-242l3192,4295r1913,l5105,1259r333,l5438,454r-2613,xm4793,3983r-4206,l587,1259r4206,l4793,3983xm1611,3281r,-810l2422,2471r-2,-42l2417,2388r-5,-41l2405,2308r-9,-40l2385,2230r-12,-38l2358,2156r-17,-36l2324,2085r-20,-34l2284,2018r-24,-32l2237,1956r-27,-30l2184,1898r-28,-27l2126,1846r-30,-24l2064,1799r-33,-21l1997,1759r-35,-18l1926,1724r-36,-14l1852,1697r-38,-11l1774,1677r-39,-7l1694,1665r-41,-3l1611,1660r-42,2l1528,1665r-41,5l1448,1677r-40,9l1369,1697r-37,13l1295,1724r-35,17l1224,1759r-33,19l1157,1799r-31,23l1096,1846r-30,25l1038,1898r-27,28l986,1956r-24,30l939,2018r-21,33l899,2085r-18,35l864,2156r-14,36l837,2230r-11,38l817,2308r-8,39l804,2388r-3,41l800,2471r1,42l804,2554r5,41l817,2634r9,40l837,2712r13,38l864,2786r17,36l899,2857r19,34l939,2924r23,32l986,2986r25,30l1038,3044r28,26l1096,3097r30,23l1157,3144r34,20l1224,3184r36,17l1295,3218r37,15l1369,3245r39,11l1448,3265r39,7l1528,3277r41,3l1611,3281xm1838,3503r,l1881,3502r40,-3l1962,3493r40,-7l2041,3477r39,-11l2117,3453r37,-14l2190,3422r35,-18l2259,3385r33,-21l2323,3341r32,-24l2384,3292r27,-27l2439,3237r25,-30l2488,3177r23,-31l2532,3112r19,-33l2570,3043r16,-35l2600,2971r12,-38l2623,2895r10,-40l2640,2816r5,-41l2648,2734r1,-42l1838,2692r,811xm4318,1839r-1037,l3281,2150r1037,l4318,1839xm4318,2411r-1037,l3281,2723r1037,l4318,2411xm4318,2983r-1037,l3281,3295r1037,l4318,2983xe" fillcolor="window" stroked="f">
                       <v:path arrowok="t" o:connecttype="custom" o:connectlocs="2147483646,0;0,2147483646;2147483646,2147483646;2147483646,2147483646;2147483646,2147483646;2147483646,2147483646;2147483646,2147483646;2147483646,2147483646;2147483646,2147483646;2147483646,2147483646;2147483646,2147483646;2147483646,2147483646;2147483646,2147483646;2147483646,2147483646;2147483646,2147483646;2147483646,2147483646;2147483646,2147483646;2147483646,2147483646;2147483646,2147483646;2147483646,2147483646;2147483646,2147483646;2147483646,2147483646;2147483646,2147483646;2147483646,2147483646;2147483646,2147483646;2147483646,2147483646;2147483646,2147483646;2147483646,2147483646;2147483646,2147483646;2147483646,2147483646;2147483646,2147483646;2147483646,2147483646;2147483646,2147483646;2147483646,2147483646;2147483646,2147483646;2147483646,2147483646;2147483646,2147483646;2147483646,2147483646;2147483646,2147483646;2147483646,2147483646;2147483646,2147483646;2147483646,2147483646;2147483646,2147483646;2147483646,2147483646;2147483646,2147483646;2147483646,2147483646;2147483646,2147483646;2147483646,2147483646;2147483646,2147483646;2147483646,2147483646;2147483646,2147483646;2147483646,2147483646;2147483646,2147483646;2147483646,2147483646;2147483646,2147483646;2147483646,2147483646;2147483646,2147483646;2147483646,2147483646;2147483646,2147483646;2147483646,2147483646" o:connectangles="0,0,0,0,0,0,0,0,0,0,0,0,0,0,0,0,0,0,0,0,0,0,0,0,0,0,0,0,0,0,0,0,0,0,0,0,0,0,0,0,0,0,0,0,0,0,0,0,0,0,0,0,0,0,0,0,0,0,0,0"/>
                     </v:shape>
                   </v:group>
                 </v:group>
-                <v:group id="组合 1180437464" o:spid="_x0000_s1044" style="position:absolute;width:23469;height:58039" coordorigin="63" coordsize="23253,48406" o:gfxdata="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">
-                  <v:group id="组合 93661502" o:spid="_x0000_s1045" style="position:absolute;left:63;width:22554;height:4575" coordorigin="10307,4738" coordsize="3552,514" o:gfxdata="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">
-                    <v:shape id="文本框 5" o:spid="_x0000_s1046" type="#_x0000_t202" style="position:absolute;left:10307;top:4738;width:3360;height:514;visibility:visible;mso-wrap-style:square;v-text-anchor:top" o:gfxdata="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" filled="f" stroked="f" strokeweight=".5pt">
+                <v:group id="组合 1180437464" o:spid="_x0000_s1045" style="position:absolute;width:23469;height:58039" coordorigin="63" coordsize="23253,48406" o:gfxdata="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">
+                  <v:group id="组合 93661502" o:spid="_x0000_s1046" style="position:absolute;left:63;width:22554;height:4575" coordorigin="10307,4738" coordsize="3552,514" o:gfxdata="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">
+                    <v:shape id="文本框 5" o:spid="_x0000_s1047" type="#_x0000_t202" style="position:absolute;left:10307;top:4738;width:3360;height:514;visibility:visible;mso-wrap-style:square;v-text-anchor:top" o:gfxdata="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" filled="f" stroked="f" strokeweight=".5pt">
                       <v:textbox>
                         <w:txbxContent>
                           <w:p>
@@ -4880,15 +5001,15 @@
                         </w:txbxContent>
                       </v:textbox>
                     </v:shape>
-                    <v:line id="直接连接符 254222622" o:spid="_x0000_s1047" style="position:absolute;visibility:visible;mso-wrap-style:square" from="10457,5194" to="13859,5194" o:connectortype="straight" o:gfxdata="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" strokecolor="#7f7f7f" strokeweight="1pt">
+                    <v:line id="直接连接符 254222622" o:spid="_x0000_s1048" style="position:absolute;visibility:visible;mso-wrap-style:square" from="10457,5194" to="13859,5194" o:connectortype="straight" o:gfxdata="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" strokecolor="#7f7f7f" strokeweight="1pt">
                       <v:stroke dashstyle="dash" joinstyle="miter"/>
                     </v:line>
                   </v:group>
-                  <v:group id="组合 1759515303" o:spid="_x0000_s1048" style="position:absolute;left:196;top:6047;width:22543;height:5396" coordorigin="8614,5913" coordsize="3552,443" o:gfxdata="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">
-                    <v:line id="直接连接符 2069236199" o:spid="_x0000_s1049" style="position:absolute;visibility:visible;mso-wrap-style:square" from="8764,6324" to="12166,6324" o:connectortype="straight" o:gfxdata="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" strokecolor="#7f7f7f" strokeweight="1pt">
+                  <v:group id="组合 1759515303" o:spid="_x0000_s1049" style="position:absolute;left:196;top:6047;width:22543;height:5396" coordorigin="8614,5913" coordsize="3552,443" o:gfxdata="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">
+                    <v:line id="直接连接符 2069236199" o:spid="_x0000_s1050" style="position:absolute;visibility:visible;mso-wrap-style:square" from="8764,6324" to="12166,6324" o:connectortype="straight" o:gfxdata="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" strokecolor="#7f7f7f" strokeweight="1pt">
                       <v:stroke dashstyle="dash" joinstyle="miter"/>
                     </v:line>
-                    <v:shape id="文本框 5" o:spid="_x0000_s1050" type="#_x0000_t202" style="position:absolute;left:8614;top:5913;width:3360;height:443;visibility:visible;mso-wrap-style:square;v-text-anchor:top" o:gfxdata="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" filled="f" stroked="f" strokeweight=".5pt">
+                    <v:shape id="文本框 5" o:spid="_x0000_s1051" type="#_x0000_t202" style="position:absolute;left:8614;top:5913;width:3360;height:443;visibility:visible;mso-wrap-style:square;v-text-anchor:top" o:gfxdata="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" filled="f" stroked="f" strokeweight=".5pt">
                       <v:textbox>
                         <w:txbxContent>
                           <w:p>
@@ -4941,11 +5062,11 @@
                       </v:textbox>
                     </v:shape>
                   </v:group>
-                  <v:group id="组合 39294369" o:spid="_x0000_s1051" style="position:absolute;left:203;top:17628;width:22764;height:5766" coordorigin="10339,7363" coordsize="3587,474" o:gfxdata="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">
-                    <v:line id="直接连接符 30" o:spid="_x0000_s1052" style="position:absolute;visibility:visible;mso-wrap-style:square" from="10524,7837" to="13926,7837" o:connectortype="straight" o:gfxdata="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" strokecolor="#7f7f7f" strokeweight="1pt">
+                  <v:group id="组合 39294369" o:spid="_x0000_s1052" style="position:absolute;left:203;top:17628;width:22764;height:5766" coordorigin="10339,7363" coordsize="3587,474" o:gfxdata="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">
+                    <v:line id="直接连接符 30" o:spid="_x0000_s1053" style="position:absolute;visibility:visible;mso-wrap-style:square" from="10524,7837" to="13926,7837" o:connectortype="straight" o:gfxdata="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" strokecolor="#7f7f7f" strokeweight="1pt">
                       <v:stroke dashstyle="dash" joinstyle="miter"/>
                     </v:line>
-                    <v:shape id="文本框 5" o:spid="_x0000_s1053" type="#_x0000_t202" style="position:absolute;left:10339;top:7363;width:3360;height:429;visibility:visible;mso-wrap-style:square;v-text-anchor:top" o:gfxdata="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" filled="f" stroked="f" strokeweight=".5pt">
+                    <v:shape id="文本框 5" o:spid="_x0000_s1054" type="#_x0000_t202" style="position:absolute;left:10339;top:7363;width:3360;height:429;visibility:visible;mso-wrap-style:square;v-text-anchor:top" o:gfxdata="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" filled="f" stroked="f" strokeweight=".5pt">
                       <v:textbox>
                         <w:txbxContent>
                           <w:p>
@@ -5000,11 +5121,11 @@
                       </v:textbox>
                     </v:shape>
                   </v:group>
-                  <v:group id="组合 445652255" o:spid="_x0000_s1054" style="position:absolute;left:196;top:11490;width:22771;height:5478" coordorigin="8624,7078" coordsize="3587,367" o:gfxdata="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">
-                    <v:line id="直接连接符 562739802" o:spid="_x0000_s1055" style="position:absolute;visibility:visible;mso-wrap-style:square" from="8809,7445" to="12211,7445" o:connectortype="straight" o:gfxdata="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" strokecolor="#7f7f7f" strokeweight="1pt">
+                  <v:group id="组合 445652255" o:spid="_x0000_s1055" style="position:absolute;left:196;top:11490;width:22771;height:5478" coordorigin="8624,7078" coordsize="3587,367" o:gfxdata="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">
+                    <v:line id="直接连接符 562739802" o:spid="_x0000_s1056" style="position:absolute;visibility:visible;mso-wrap-style:square" from="8809,7445" to="12211,7445" o:connectortype="straight" o:gfxdata="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" strokecolor="#7f7f7f" strokeweight="1pt">
                       <v:stroke dashstyle="dash" joinstyle="miter"/>
                     </v:line>
-                    <v:shape id="文本框 5" o:spid="_x0000_s1056" type="#_x0000_t202" style="position:absolute;left:8624;top:7078;width:3360;height:320;visibility:visible;mso-wrap-style:square;v-text-anchor:top" o:gfxdata="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" filled="f" stroked="f" strokeweight=".5pt">
+                    <v:shape id="文本框 5" o:spid="_x0000_s1057" type="#_x0000_t202" style="position:absolute;left:8624;top:7078;width:3360;height:320;visibility:visible;mso-wrap-style:square;v-text-anchor:top" o:gfxdata="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" filled="f" stroked="f" strokeweight=".5pt">
                       <v:textbox>
                         <w:txbxContent>
                           <w:p>
@@ -5059,11 +5180,11 @@
                       </v:textbox>
                     </v:shape>
                   </v:group>
-                  <v:group id="组合 2101102911" o:spid="_x0000_s1057" style="position:absolute;left:209;top:30277;width:22974;height:5841" coordorigin="10340,6847" coordsize="3620,480" o:gfxdata="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">
-                    <v:line id="直接连接符 30" o:spid="_x0000_s1058" style="position:absolute;visibility:visible;mso-wrap-style:square" from="10558,7327" to="13960,7327" o:connectortype="straight" o:gfxdata="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" strokecolor="#7f7f7f" strokeweight="1pt">
+                  <v:group id="组合 2101102911" o:spid="_x0000_s1058" style="position:absolute;left:209;top:30277;width:22974;height:5841" coordorigin="10340,6847" coordsize="3620,480" o:gfxdata="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">
+                    <v:line id="直接连接符 30" o:spid="_x0000_s1059" style="position:absolute;visibility:visible;mso-wrap-style:square" from="10558,7327" to="13960,7327" o:connectortype="straight" o:gfxdata="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" strokecolor="#7f7f7f" strokeweight="1pt">
                       <v:stroke dashstyle="dash" joinstyle="miter"/>
                     </v:line>
-                    <v:shape id="文本框 5" o:spid="_x0000_s1059" type="#_x0000_t202" style="position:absolute;left:10340;top:6847;width:3360;height:415;visibility:visible;mso-wrap-style:square;v-text-anchor:top" o:gfxdata="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" filled="f" stroked="f" strokeweight=".5pt">
+                    <v:shape id="文本框 5" o:spid="_x0000_s1060" type="#_x0000_t202" style="position:absolute;left:10340;top:6847;width:3360;height:415;visibility:visible;mso-wrap-style:square;v-text-anchor:top" o:gfxdata="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" filled="f" stroked="f" strokeweight=".5pt">
                       <v:textbox>
                         <w:txbxContent>
                           <w:p>
@@ -5116,11 +5237,11 @@
                       </v:textbox>
                     </v:shape>
                   </v:group>
-                  <v:group id="组合 744750492" o:spid="_x0000_s1060" style="position:absolute;left:76;top:36655;width:23241;height:5380" coordorigin="10289,6487" coordsize="3662,442" o:gfxdata="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">
-                    <v:line id="直接连接符 30" o:spid="_x0000_s1061" style="position:absolute;visibility:visible;mso-wrap-style:square" from="10549,6929" to="13951,6929" o:connectortype="straight" o:gfxdata="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" strokecolor="#7f7f7f" strokeweight="1pt">
+                  <v:group id="组合 744750492" o:spid="_x0000_s1061" style="position:absolute;left:76;top:36655;width:23241;height:5380" coordorigin="10289,6487" coordsize="3662,442" o:gfxdata="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">
+                    <v:line id="直接连接符 30" o:spid="_x0000_s1062" style="position:absolute;visibility:visible;mso-wrap-style:square" from="10549,6929" to="13951,6929" o:connectortype="straight" o:gfxdata="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" strokecolor="#7f7f7f" strokeweight="1pt">
                       <v:stroke dashstyle="dash" joinstyle="miter"/>
                     </v:line>
-                    <v:shape id="文本框 5" o:spid="_x0000_s1062" type="#_x0000_t202" style="position:absolute;left:10289;top:6487;width:3360;height:405;visibility:visible;mso-wrap-style:square;v-text-anchor:top" o:gfxdata="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" filled="f" stroked="f" strokeweight=".5pt">
+                    <v:shape id="文本框 5" o:spid="_x0000_s1063" type="#_x0000_t202" style="position:absolute;left:10289;top:6487;width:3360;height:405;visibility:visible;mso-wrap-style:square;v-text-anchor:top" o:gfxdata="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" filled="f" stroked="f" strokeweight=".5pt">
                       <v:textbox>
                         <w:txbxContent>
                           <w:p>
@@ -5173,11 +5294,11 @@
                       </v:textbox>
                     </v:shape>
                   </v:group>
-                  <v:group id="组合 471803461" o:spid="_x0000_s1063" style="position:absolute;left:196;top:42526;width:22987;height:5880" coordorigin="10308,6171" coordsize="3621,483" o:gfxdata="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">
-                    <v:line id="直接连接符 30" o:spid="_x0000_s1064" style="position:absolute;visibility:visible;mso-wrap-style:square" from="10527,6654" to="13929,6654" o:connectortype="straight" o:gfxdata="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" strokecolor="#7f7f7f" strokeweight="1pt">
+                  <v:group id="组合 471803461" o:spid="_x0000_s1064" style="position:absolute;left:196;top:42526;width:22987;height:5880" coordorigin="10308,6171" coordsize="3621,483" o:gfxdata="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">
+                    <v:line id="直接连接符 30" o:spid="_x0000_s1065" style="position:absolute;visibility:visible;mso-wrap-style:square" from="10527,6654" to="13929,6654" o:connectortype="straight" o:gfxdata="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" strokecolor="#7f7f7f" strokeweight="1pt">
                       <v:stroke dashstyle="dash" joinstyle="miter"/>
                     </v:line>
-                    <v:shape id="文本框 5" o:spid="_x0000_s1065" type="#_x0000_t202" style="position:absolute;left:10308;top:6171;width:3426;height:414;visibility:visible;mso-wrap-style:square;v-text-anchor:top" o:gfxdata="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" filled="f" stroked="f" strokeweight=".5pt">
+                    <v:shape id="文本框 5" o:spid="_x0000_s1066" type="#_x0000_t202" style="position:absolute;left:10308;top:6171;width:3426;height:414;visibility:visible;mso-wrap-style:square;v-text-anchor:top" o:gfxdata="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" filled="f" stroked="f" strokeweight=".5pt">
                       <v:textbox>
                         <w:txbxContent>
                           <w:p>
@@ -5239,11 +5360,11 @@
                       </v:textbox>
                     </v:shape>
                   </v:group>
-                  <v:group id="组合 302434646" o:spid="_x0000_s1066" style="position:absolute;left:203;top:24020;width:22987;height:5513" coordorigin="10309,7113" coordsize="3621,453" o:gfxdata="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">
-                    <v:line id="直接连接符 30" o:spid="_x0000_s1067" style="position:absolute;visibility:visible;mso-wrap-style:square" from="10528,7566" to="13930,7566" o:connectortype="straight" o:gfxdata="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" strokecolor="#7f7f7f" strokeweight="1pt">
+                  <v:group id="组合 302434646" o:spid="_x0000_s1067" style="position:absolute;left:203;top:24020;width:22987;height:5513" coordorigin="10309,7113" coordsize="3621,453" o:gfxdata="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">
+                    <v:line id="直接连接符 30" o:spid="_x0000_s1068" style="position:absolute;visibility:visible;mso-wrap-style:square" from="10528,7566" to="13930,7566" o:connectortype="straight" o:gfxdata="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" strokecolor="#7f7f7f" strokeweight="1pt">
                       <v:stroke dashstyle="dash" joinstyle="miter"/>
                     </v:line>
-                    <v:shape id="文本框 5" o:spid="_x0000_s1068" type="#_x0000_t202" style="position:absolute;left:10309;top:7113;width:3360;height:413;visibility:visible;mso-wrap-style:square;v-text-anchor:top" o:gfxdata="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" filled="f" stroked="f" strokeweight=".5pt">
+                    <v:shape id="文本框 5" o:spid="_x0000_s1069" type="#_x0000_t202" style="position:absolute;left:10309;top:7113;width:3360;height:413;visibility:visible;mso-wrap-style:square;v-text-anchor:top" o:gfxdata="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" filled="f" stroked="f" strokeweight=".5pt">
                       <v:textbox>
                         <w:txbxContent>
                           <w:p>
@@ -5310,145 +5431,6 @@
                   </v:group>
                 </v:group>
               </v:group>
-            </w:pict>
-          </mc:Fallback>
-        </mc:AlternateContent>
-      </w:r>
-      <w:r>
-        <w:rPr>
-          <w:rFonts w:ascii="微软雅黑" w:eastAsia="微软雅黑" w:hAnsi="微软雅黑"/>
-          <w:noProof/>
-        </w:rPr>
-        <mc:AlternateContent>
-          <mc:Choice Requires="wps">
-            <w:drawing>
-              <wp:anchor distT="0" distB="0" distL="114300" distR="114300" simplePos="0" relativeHeight="251728896" behindDoc="0" locked="0" layoutInCell="1" allowOverlap="1" wp14:anchorId="78403FFB" wp14:editId="12E0B0D1">
-                <wp:simplePos x="0" y="0"/>
-                <wp:positionH relativeFrom="column">
-                  <wp:posOffset>-720090</wp:posOffset>
-                </wp:positionH>
-                <wp:positionV relativeFrom="paragraph">
-                  <wp:posOffset>7646670</wp:posOffset>
-                </wp:positionV>
-                <wp:extent cx="7505700" cy="1985010"/>
-                <wp:effectExtent l="38100" t="114300" r="133350" b="53340"/>
-                <wp:wrapNone/>
-                <wp:docPr id="209" name="流程图: 手动输入 2"/>
-                <wp:cNvGraphicFramePr/>
-                <a:graphic xmlns:a="http://schemas.openxmlformats.org/drawingml/2006/main">
-                  <a:graphicData uri="http://schemas.microsoft.com/office/word/2010/wordprocessingShape">
-                    <wps:wsp>
-                      <wps:cNvSpPr/>
-                      <wps:spPr>
-                        <a:xfrm flipH="1">
-                          <a:off x="0" y="0"/>
-                          <a:ext cx="7505700" cy="1985010"/>
-                        </a:xfrm>
-                        <a:custGeom>
-                          <a:avLst/>
-                          <a:gdLst>
-                            <a:gd name="connsiteX0" fmla="*/ 0 w 10000"/>
-                            <a:gd name="connsiteY0" fmla="*/ 2286 h 10000"/>
-                            <a:gd name="connsiteX1" fmla="*/ 10000 w 10000"/>
-                            <a:gd name="connsiteY1" fmla="*/ 0 h 10000"/>
-                            <a:gd name="connsiteX2" fmla="*/ 10000 w 10000"/>
-                            <a:gd name="connsiteY2" fmla="*/ 10000 h 10000"/>
-                            <a:gd name="connsiteX3" fmla="*/ 0 w 10000"/>
-                            <a:gd name="connsiteY3" fmla="*/ 10000 h 10000"/>
-                            <a:gd name="connsiteX4" fmla="*/ 0 w 10000"/>
-                            <a:gd name="connsiteY4" fmla="*/ 2286 h 10000"/>
-                          </a:gdLst>
-                          <a:ahLst/>
-                          <a:cxnLst>
-                            <a:cxn ang="0">
-                              <a:pos x="connsiteX0" y="connsiteY0"/>
-                            </a:cxn>
-                            <a:cxn ang="0">
-                              <a:pos x="connsiteX1" y="connsiteY1"/>
-                            </a:cxn>
-                            <a:cxn ang="0">
-                              <a:pos x="connsiteX2" y="connsiteY2"/>
-                            </a:cxn>
-                            <a:cxn ang="0">
-                              <a:pos x="connsiteX3" y="connsiteY3"/>
-                            </a:cxn>
-                            <a:cxn ang="0">
-                              <a:pos x="connsiteX4" y="connsiteY4"/>
-                            </a:cxn>
-                          </a:cxnLst>
-                          <a:rect l="l" t="t" r="r" b="b"/>
-                          <a:pathLst>
-                            <a:path w="10000" h="10000">
-                              <a:moveTo>
-                                <a:pt x="0" y="2286"/>
-                              </a:moveTo>
-                              <a:lnTo>
-                                <a:pt x="10000" y="0"/>
-                              </a:lnTo>
-                              <a:lnTo>
-                                <a:pt x="10000" y="10000"/>
-                              </a:lnTo>
-                              <a:lnTo>
-                                <a:pt x="0" y="10000"/>
-                              </a:lnTo>
-                              <a:lnTo>
-                                <a:pt x="0" y="2286"/>
-                              </a:lnTo>
-                              <a:close/>
-                            </a:path>
-                          </a:pathLst>
-                        </a:custGeom>
-                        <a:solidFill>
-                          <a:srgbClr val="5290BF"/>
-                        </a:solidFill>
-                        <a:ln w="12700" cap="flat" cmpd="sng" algn="ctr">
-                          <a:solidFill>
-                            <a:srgbClr val="5290BF"/>
-                          </a:solidFill>
-                          <a:prstDash val="solid"/>
-                          <a:miter lim="800000"/>
-                        </a:ln>
-                        <a:effectLst>
-                          <a:outerShdw blurRad="63500" dist="50800" dir="18900000" algn="bl" rotWithShape="0">
-                            <a:prstClr val="black">
-                              <a:alpha val="16000"/>
-                            </a:prstClr>
-                          </a:outerShdw>
-                        </a:effectLst>
-                      </wps:spPr>
-                      <wps:txbx>
-                        <w:txbxContent>
-                          <w:p/>
-                        </w:txbxContent>
-                      </wps:txbx>
-                      <wps:bodyPr rot="0" spcFirstLastPara="0" vertOverflow="overflow" horzOverflow="overflow" vert="horz" wrap="square" lIns="91440" tIns="45720" rIns="91440" bIns="45720" numCol="1" spcCol="0" rtlCol="0" fromWordArt="0" anchor="ctr" anchorCtr="0" forceAA="0" compatLnSpc="1">
-                        <a:noAutofit/>
-                      </wps:bodyPr>
-                    </wps:wsp>
-                  </a:graphicData>
-                </a:graphic>
-                <wp14:sizeRelH relativeFrom="margin">
-                  <wp14:pctWidth>0</wp14:pctWidth>
-                </wp14:sizeRelH>
-                <wp14:sizeRelV relativeFrom="margin">
-                  <wp14:pctHeight>0</wp14:pctHeight>
-                </wp14:sizeRelV>
-              </wp:anchor>
-            </w:drawing>
-          </mc:Choice>
-          <mc:Fallback>
-            <w:pict>
-              <v:shape w14:anchorId="78403FFB" id="流程图: 手动输入 2" o:spid="_x0000_s1069" style="position:absolute;margin-left:-56.7pt;margin-top:602.1pt;width:591pt;height:156.3pt;flip:x;z-index:251728896;visibility:visible;mso-wrap-style:square;mso-width-percent:0;mso-height-percent:0;mso-wrap-distance-left:9pt;mso-wrap-distance-top:0;mso-wrap-distance-right:9pt;mso-wrap-distance-bottom:0;mso-position-horizontal:absolute;mso-position-horizontal-relative:text;mso-position-vertical:absolute;mso-position-vertical-relative:text;mso-width-percent:0;mso-height-percent:0;mso-width-relative:margin;mso-height-relative:margin;v-text-anchor:middle" coordsize="10000,10000" o:spt="100" o:gfxdata="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" adj="-11796480,,5400" path="m,2286l10000,r,10000l,10000,,2286xe" fillcolor="#5290bf" strokecolor="#5290bf" strokeweight="1pt">
-                <v:stroke joinstyle="miter"/>
-                <v:shadow on="t" color="black" opacity="10485f" origin="-.5,.5" offset=".99781mm,-.99781mm"/>
-                <v:formulas/>
-                <v:path arrowok="t" o:connecttype="custom" o:connectlocs="0,453773;7505700,0;7505700,1985010;0,1985010;0,453773" o:connectangles="0,0,0,0,0" textboxrect="0,0,10000,10000"/>
-                <v:textbox>
-                  <w:txbxContent>
-                    <w:p/>
-                  </w:txbxContent>
-                </v:textbox>
-              </v:shape>
             </w:pict>
           </mc:Fallback>
         </mc:AlternateContent>
@@ -7774,7 +7756,6 @@
       <w:pPr>
         <w:pStyle w:val="1"/>
         <w:rPr>
-          <w:rFonts w:hint="eastAsia"/>
           <w:color w:val="FFFFFF" w:themeColor="background1"/>
         </w:rPr>
       </w:pPr>
@@ -8349,7 +8330,6 @@
     <w:p>
       <w:pPr>
         <w:rPr>
-          <w:rFonts w:hint="eastAsia"/>
           <w:color w:val="FFFFFF" w:themeColor="background1"/>
         </w:rPr>
       </w:pPr>
@@ -8419,7 +8399,6 @@
     <w:p>
       <w:pPr>
         <w:rPr>
-          <w:rFonts w:hint="eastAsia"/>
           <w:color w:val="FFFFFF" w:themeColor="background1"/>
         </w:rPr>
       </w:pPr>

</xml_diff>